<commit_message>
Split trip and reimbursement flows with dual export
</commit_message>
<xml_diff>
--- a/public/template.docx
+++ b/public/template.docx
@@ -25,7 +25,7 @@
           <w:b/>
           <w:sz w:val="32"/>
         </w:rPr>
-        <w:t>出差申请及报销申请表（二合一）</w:t>
+        <w:t>{form_title}</w:t>
       </w:r>
     </w:p>
     <w:tbl>
@@ -606,7 +606,7 @@
                 <w:b w:val="0"/>
                 <w:sz w:val="24"/>
               </w:rPr>
-              <w:t>预算</w:t>
+              <w:t>金额</w:t>
             </w:r>
           </w:p>
         </w:tc>
@@ -1294,7 +1294,7 @@
                 <w:b w:val="0"/>
                 <w:sz w:val="24"/>
               </w:rPr>
-              <w:t>预算</w:t>
+              <w:t>金额</w:t>
             </w:r>
           </w:p>
         </w:tc>
@@ -2415,7 +2415,7 @@
           <w:rFonts w:ascii="宋体" w:hAnsi="宋体" w:eastAsia="宋体"/>
           <w:sz w:val="24"/>
         </w:rPr>
-        <w:t>出差前申请：请在</w:t>
+        <w:t>基本原则：</w:t>
       </w:r>
       <w:r>
         <w:rPr>
@@ -2423,61 +2423,7 @@
           <w:sz w:val="24"/>
           <w:u w:val="single"/>
         </w:rPr>
-        <w:t>出差前至少提前两周预填写</w:t>
-      </w:r>
-      <w:r>
-        <w:rPr>
-          <w:rFonts w:ascii="宋体" w:hAnsi="宋体" w:eastAsia="宋体"/>
-          <w:sz w:val="24"/>
-        </w:rPr>
-        <w:t>提交至部门主管，经总经理批准后生效。</w:t>
-      </w:r>
-    </w:p>
-    <w:p>
-      <w:pPr>
-        <w:spacing w:before="0" w:after="0" w:line="288" w:lineRule="auto"/>
-      </w:pPr>
-      <w:r>
-        <w:rPr>
-          <w:rFonts w:ascii="宋体" w:hAnsi="宋体" w:eastAsia="宋体"/>
-          <w:sz w:val="24"/>
-        </w:rPr>
-        <w:t>出差后报销：请在</w:t>
-      </w:r>
-      <w:r>
-        <w:rPr>
-          <w:rFonts w:ascii="宋体" w:hAnsi="宋体" w:eastAsia="宋体"/>
-          <w:sz w:val="24"/>
-          <w:u w:val="single"/>
-        </w:rPr>
-        <w:t>出差返回后七个工作日内按实际费用</w:t>
-      </w:r>
-      <w:r>
-        <w:rPr>
-          <w:rFonts w:ascii="宋体" w:hAnsi="宋体" w:eastAsia="宋体"/>
-          <w:sz w:val="24"/>
-        </w:rPr>
-        <w:t>再次填写，完成后提交给部门主管，部门主管提交至总经理，通过后提交至财务人员。</w:t>
-      </w:r>
-    </w:p>
-    <w:p>
-      <w:pPr>
-        <w:spacing w:before="0" w:after="0" w:line="288" w:lineRule="auto"/>
-      </w:pPr>
-      <w:r>
-        <w:rPr>
-          <w:rFonts w:ascii="宋体" w:hAnsi="宋体" w:eastAsia="宋体"/>
-          <w:sz w:val="24"/>
-        </w:rPr>
-        <w:t>各项支出具体标准请参考</w:t>
-      </w:r>
-      <w:r>
-        <w:rPr>
-          <w:rFonts w:ascii="宋体" w:hAnsi="宋体" w:eastAsia="宋体"/>
-          <w:sz w:val="24"/>
-          <w:u w:val="single"/>
-        </w:rPr>
-        <w:t>《乾坤恒泰差旅费管理办法》</w:t>
+        <w:t>厉行节约、预算控制、事前审批、真实合规</w:t>
       </w:r>
       <w:r>
         <w:rPr>
@@ -2496,7 +2442,7 @@
           <w:rFonts w:ascii="宋体" w:hAnsi="宋体" w:eastAsia="宋体"/>
           <w:sz w:val="24"/>
         </w:rPr>
-        <w:t>本报销单必须填写</w:t>
+        <w:t>出差前填写申请表，明确</w:t>
       </w:r>
       <w:r>
         <w:rPr>
@@ -2504,14 +2450,14 @@
           <w:sz w:val="24"/>
           <w:u w:val="single"/>
         </w:rPr>
-        <w:t>完整、准确、合规</w:t>
+        <w:t>出差事由、时间、地点、预算</w:t>
       </w:r>
       <w:r>
         <w:rPr>
           <w:rFonts w:ascii="宋体" w:hAnsi="宋体" w:eastAsia="宋体"/>
           <w:sz w:val="24"/>
         </w:rPr>
-        <w:t>，缺失或不准确的信息将无法审核通过。</w:t>
+        <w:t>，并完成部门主管审核和总经理批准。</w:t>
       </w:r>
     </w:p>
     <w:p>
@@ -2523,7 +2469,22 @@
           <w:rFonts w:ascii="宋体" w:hAnsi="宋体" w:eastAsia="宋体"/>
           <w:sz w:val="24"/>
         </w:rPr>
-        <w:t>用于报销时请必仔细核对填写的各项数据，一旦审核通过，不得随意更改。</w:t>
+        <w:t>城市间交通优先选择经济便捷的交通工具，</w:t>
+      </w:r>
+      <w:r>
+        <w:rPr>
+          <w:rFonts w:ascii="宋体" w:hAnsi="宋体" w:eastAsia="宋体"/>
+          <w:sz w:val="24"/>
+          <w:u w:val="single"/>
+        </w:rPr>
+        <w:t>三选一</w:t>
+      </w:r>
+      <w:r>
+        <w:rPr>
+          <w:rFonts w:ascii="宋体" w:hAnsi="宋体" w:eastAsia="宋体"/>
+          <w:sz w:val="24"/>
+        </w:rPr>
+        <w:t>；特殊情况需提前说明，未经许可超标部分由个人承担。</w:t>
       </w:r>
     </w:p>
     <w:p>
@@ -2535,7 +2496,7 @@
           <w:rFonts w:ascii="宋体" w:hAnsi="宋体" w:eastAsia="宋体"/>
           <w:sz w:val="24"/>
         </w:rPr>
-        <w:t>所有支出须</w:t>
+        <w:t>住宿标准：</w:t>
       </w:r>
       <w:r>
         <w:rPr>
@@ -2543,34 +2504,7 @@
           <w:sz w:val="24"/>
           <w:u w:val="single"/>
         </w:rPr>
-        <w:t>同步提供有效票据</w:t>
-      </w:r>
-      <w:r>
-        <w:rPr>
-          <w:rFonts w:ascii="宋体" w:hAnsi="宋体" w:eastAsia="宋体"/>
-          <w:sz w:val="24"/>
-        </w:rPr>
-        <w:t>，票据电子版与本单同步提交，不得缺失、修改、替换。</w:t>
-      </w:r>
-    </w:p>
-    <w:p>
-      <w:pPr>
-        <w:spacing w:before="0" w:after="0" w:line="288" w:lineRule="auto"/>
-      </w:pPr>
-      <w:r>
-        <w:rPr>
-          <w:rFonts w:ascii="宋体" w:hAnsi="宋体" w:eastAsia="宋体"/>
-          <w:sz w:val="24"/>
-        </w:rPr>
-        <w:t>审核结果通过，报销费用将在</w:t>
-      </w:r>
-      <w:r>
-        <w:rPr>
-          <w:rFonts w:ascii="宋体" w:hAnsi="宋体" w:eastAsia="宋体"/>
-          <w:sz w:val="24"/>
-          <w:u w:val="single"/>
-        </w:rPr>
-        <w:t>下次发放工资时汇入与工资相同的银行账户</w:t>
+        <w:t>一线城市 1000 元/晚以内，省会城市 800 元/晚以内，其他城市 600 元/晚以内</w:t>
       </w:r>
       <w:r>
         <w:rPr>
@@ -2589,7 +2523,22 @@
           <w:rFonts w:ascii="宋体" w:hAnsi="宋体" w:eastAsia="宋体"/>
           <w:sz w:val="24"/>
         </w:rPr>
-        <w:t>审核结果不通过，申报人员需及时了解原因并进行调整。</w:t>
+        <w:t>餐费和市内交通费</w:t>
+      </w:r>
+      <w:r>
+        <w:rPr>
+          <w:rFonts w:ascii="宋体" w:hAnsi="宋体" w:eastAsia="宋体"/>
+          <w:sz w:val="24"/>
+          <w:u w:val="single"/>
+        </w:rPr>
+        <w:t>标准内根据有效票据实报实销</w:t>
+      </w:r>
+      <w:r>
+        <w:rPr>
+          <w:rFonts w:ascii="宋体" w:hAnsi="宋体" w:eastAsia="宋体"/>
+          <w:sz w:val="24"/>
+        </w:rPr>
+        <w:t>；接待单位安排工作餐或交通工具的，不单独报销。</w:t>
       </w:r>
     </w:p>
     <w:p>
@@ -2601,7 +2550,49 @@
           <w:rFonts w:ascii="宋体" w:hAnsi="宋体" w:eastAsia="宋体"/>
           <w:sz w:val="24"/>
         </w:rPr>
-        <w:t>请在填写报销单时认真核对并按照要求填写，以便费用能够及时审核完成报销。</w:t>
+        <w:t>报销须在</w:t>
+      </w:r>
+      <w:r>
+        <w:rPr>
+          <w:rFonts w:ascii="宋体" w:hAnsi="宋体" w:eastAsia="宋体"/>
+          <w:sz w:val="24"/>
+          <w:u w:val="single"/>
+        </w:rPr>
+        <w:t>出差结束后 7 个工作日内</w:t>
+      </w:r>
+      <w:r>
+        <w:rPr>
+          <w:rFonts w:ascii="宋体" w:hAnsi="宋体" w:eastAsia="宋体"/>
+          <w:sz w:val="24"/>
+        </w:rPr>
+        <w:t>完成，超期需书面说明。</w:t>
+      </w:r>
+    </w:p>
+    <w:p>
+      <w:pPr>
+        <w:spacing w:before="0" w:after="0" w:line="288" w:lineRule="auto"/>
+      </w:pPr>
+      <w:r>
+        <w:rPr>
+          <w:rFonts w:ascii="宋体" w:hAnsi="宋体" w:eastAsia="宋体"/>
+          <w:sz w:val="24"/>
+        </w:rPr>
+        <w:t>所有票据及附件需</w:t>
+      </w:r>
+      <w:r>
+        <w:rPr>
+          <w:rFonts w:ascii="宋体" w:hAnsi="宋体" w:eastAsia="宋体"/>
+          <w:sz w:val="24"/>
+          <w:u w:val="single"/>
+        </w:rPr>
+        <w:t>真实、合法、完整</w:t>
+      </w:r>
+      <w:r>
+        <w:rPr>
+          <w:rFonts w:ascii="宋体" w:hAnsi="宋体" w:eastAsia="宋体"/>
+          <w:sz w:val="24"/>
+        </w:rPr>
+        <w:t>，用于纳税和审计。</w:t>
       </w:r>
     </w:p>
     <w:sectPr>

</xml_diff>

<commit_message>
Refine grouped travel and reimbursement entry flows
</commit_message>
<xml_diff>
--- a/public/template.docx
+++ b/public/template.docx
@@ -37,35 +37,17 @@
         <w:tblLook w:firstColumn="1" w:firstRow="1" w:lastColumn="0" w:lastRow="0" w:noHBand="0" w:noVBand="1" w:val="04A0"/>
       </w:tblPr>
       <w:tblGrid>
-        <w:gridCol w:w="1644"/>
-        <w:gridCol w:w="397"/>
-        <w:gridCol w:w="397"/>
-        <w:gridCol w:w="397"/>
-        <w:gridCol w:w="397"/>
-        <w:gridCol w:w="397"/>
-        <w:gridCol w:w="397"/>
-        <w:gridCol w:w="397"/>
-        <w:gridCol w:w="397"/>
-        <w:gridCol w:w="397"/>
-        <w:gridCol w:w="397"/>
-        <w:gridCol w:w="397"/>
-        <w:gridCol w:w="397"/>
-        <w:gridCol w:w="397"/>
-        <w:gridCol w:w="397"/>
-        <w:gridCol w:w="397"/>
-        <w:gridCol w:w="397"/>
-        <w:gridCol w:w="397"/>
-        <w:gridCol w:w="397"/>
-        <w:gridCol w:w="397"/>
-        <w:gridCol w:w="397"/>
+        <w:gridCol w:w="1739"/>
+        <w:gridCol w:w="1739"/>
+        <w:gridCol w:w="1739"/>
+        <w:gridCol w:w="1739"/>
+        <w:gridCol w:w="1739"/>
+        <w:gridCol w:w="1739"/>
       </w:tblGrid>
       <w:tr>
-        <w:trPr>
-          <w:trHeight w:hRule="atLeast" w:val="567"/>
-        </w:trPr>
         <w:tc>
           <w:tcPr>
-            <w:tcW w:type="dxa" w:w="1644"/>
+            <w:tcW w:type="dxa" w:w="1587"/>
             <w:tcBorders>
               <w:left w:val="single" w:sz="8" w:color="BFBFBF"/>
               <w:top w:val="single" w:sz="8" w:color="BFBFBF"/>
@@ -76,7 +58,7 @@
           </w:tcPr>
           <w:p>
             <w:pPr>
-              <w:spacing w:before="0" w:after="0"/>
+              <w:spacing w:before="0" w:after="0" w:line="240" w:lineRule="auto"/>
               <w:jc w:val="center"/>
             </w:pPr>
             <w:r/>
@@ -84,7 +66,7 @@
               <w:rPr>
                 <w:rFonts w:ascii="宋体" w:hAnsi="宋体" w:eastAsia="宋体"/>
                 <w:b w:val="0"/>
-                <w:sz w:val="24"/>
+                <w:sz w:val="22"/>
               </w:rPr>
               <w:t>本表用途</w:t>
             </w:r>
@@ -92,8 +74,8 @@
         </w:tc>
         <w:tc>
           <w:tcPr>
-            <w:tcW w:type="dxa" w:w="3970"/>
-            <w:gridSpan w:val="10"/>
+            <w:tcW w:type="dxa" w:w="3402"/>
+            <w:gridSpan w:val="2"/>
             <w:tcBorders>
               <w:left w:val="single" w:sz="8" w:color="BFBFBF"/>
               <w:top w:val="single" w:sz="8" w:color="BFBFBF"/>
@@ -104,7 +86,7 @@
           </w:tcPr>
           <w:p>
             <w:pPr>
-              <w:spacing w:before="0" w:after="0"/>
+              <w:spacing w:before="0" w:after="0" w:line="240" w:lineRule="auto"/>
               <w:jc w:val="center"/>
             </w:pPr>
             <w:r/>
@@ -120,8 +102,8 @@
         </w:tc>
         <w:tc>
           <w:tcPr>
-            <w:tcW w:type="dxa" w:w="3970"/>
-            <w:gridSpan w:val="10"/>
+            <w:tcW w:type="dxa" w:w="5103"/>
+            <w:gridSpan w:val="3"/>
             <w:tcBorders>
               <w:left w:val="single" w:sz="8" w:color="BFBFBF"/>
               <w:top w:val="single" w:sz="8" w:color="BFBFBF"/>
@@ -132,7 +114,7 @@
           </w:tcPr>
           <w:p>
             <w:pPr>
-              <w:spacing w:before="0" w:after="0"/>
+              <w:spacing w:before="0" w:after="0" w:line="240" w:lineRule="auto"/>
               <w:jc w:val="center"/>
             </w:pPr>
             <w:r/>
@@ -148,12 +130,9 @@
         </w:tc>
       </w:tr>
       <w:tr>
-        <w:trPr>
-          <w:trHeight w:hRule="atLeast" w:val="567"/>
-        </w:trPr>
         <w:tc>
           <w:tcPr>
-            <w:tcW w:type="dxa" w:w="1644"/>
+            <w:tcW w:type="dxa" w:w="1587"/>
             <w:tcBorders>
               <w:left w:val="single" w:sz="8" w:color="BFBFBF"/>
               <w:top w:val="single" w:sz="8" w:color="BFBFBF"/>
@@ -164,7 +143,7 @@
           </w:tcPr>
           <w:p>
             <w:pPr>
-              <w:spacing w:before="0" w:after="0"/>
+              <w:spacing w:before="0" w:after="0" w:line="240" w:lineRule="auto"/>
               <w:jc w:val="center"/>
             </w:pPr>
             <w:r/>
@@ -172,7 +151,7 @@
               <w:rPr>
                 <w:rFonts w:ascii="宋体" w:hAnsi="宋体" w:eastAsia="宋体"/>
                 <w:b w:val="0"/>
-                <w:sz w:val="24"/>
+                <w:sz w:val="22"/>
               </w:rPr>
               <w:t>员工姓名</w:t>
             </w:r>
@@ -180,8 +159,8 @@
         </w:tc>
         <w:tc>
           <w:tcPr>
-            <w:tcW w:type="dxa" w:w="3176"/>
-            <w:gridSpan w:val="8"/>
+            <w:tcW w:type="dxa" w:w="3402"/>
+            <w:gridSpan w:val="2"/>
             <w:tcBorders>
               <w:left w:val="single" w:sz="8" w:color="BFBFBF"/>
               <w:top w:val="single" w:sz="8" w:color="BFBFBF"/>
@@ -192,7 +171,7 @@
           </w:tcPr>
           <w:p>
             <w:pPr>
-              <w:spacing w:before="0" w:after="0"/>
+              <w:spacing w:before="0" w:after="0" w:line="240" w:lineRule="auto"/>
               <w:jc w:val="left"/>
             </w:pPr>
             <w:r/>
@@ -208,8 +187,7 @@
         </w:tc>
         <w:tc>
           <w:tcPr>
-            <w:tcW w:type="dxa" w:w="1985"/>
-            <w:gridSpan w:val="5"/>
+            <w:tcW w:type="dxa" w:w="1701"/>
             <w:tcBorders>
               <w:left w:val="single" w:sz="8" w:color="BFBFBF"/>
               <w:top w:val="single" w:sz="8" w:color="BFBFBF"/>
@@ -220,7 +198,7 @@
           </w:tcPr>
           <w:p>
             <w:pPr>
-              <w:spacing w:before="0" w:after="0"/>
+              <w:spacing w:before="0" w:after="0" w:line="240" w:lineRule="auto"/>
               <w:jc w:val="center"/>
             </w:pPr>
             <w:r/>
@@ -228,7 +206,7 @@
               <w:rPr>
                 <w:rFonts w:ascii="宋体" w:hAnsi="宋体" w:eastAsia="宋体"/>
                 <w:b w:val="0"/>
-                <w:sz w:val="24"/>
+                <w:sz w:val="22"/>
               </w:rPr>
               <w:t>部门（HTC/SHOB）</w:t>
             </w:r>
@@ -236,8 +214,8 @@
         </w:tc>
         <w:tc>
           <w:tcPr>
-            <w:tcW w:type="dxa" w:w="2779"/>
-            <w:gridSpan w:val="7"/>
+            <w:tcW w:type="dxa" w:w="3402"/>
+            <w:gridSpan w:val="2"/>
             <w:tcBorders>
               <w:left w:val="single" w:sz="8" w:color="BFBFBF"/>
               <w:top w:val="single" w:sz="8" w:color="BFBFBF"/>
@@ -248,7 +226,7 @@
           </w:tcPr>
           <w:p>
             <w:pPr>
-              <w:spacing w:before="0" w:after="0"/>
+              <w:spacing w:before="0" w:after="0" w:line="240" w:lineRule="auto"/>
               <w:jc w:val="left"/>
             </w:pPr>
             <w:r/>
@@ -264,12 +242,9 @@
         </w:tc>
       </w:tr>
       <w:tr>
-        <w:trPr>
-          <w:trHeight w:hRule="atLeast" w:val="567"/>
-        </w:trPr>
         <w:tc>
           <w:tcPr>
-            <w:tcW w:type="dxa" w:w="1644"/>
+            <w:tcW w:type="dxa" w:w="1587"/>
             <w:tcBorders>
               <w:left w:val="single" w:sz="8" w:color="BFBFBF"/>
               <w:top w:val="single" w:sz="8" w:color="BFBFBF"/>
@@ -280,7 +255,7 @@
           </w:tcPr>
           <w:p>
             <w:pPr>
-              <w:spacing w:before="0" w:after="0"/>
+              <w:spacing w:before="0" w:after="0" w:line="240" w:lineRule="auto"/>
               <w:jc w:val="center"/>
             </w:pPr>
             <w:r/>
@@ -288,7 +263,7 @@
               <w:rPr>
                 <w:rFonts w:ascii="宋体" w:hAnsi="宋体" w:eastAsia="宋体"/>
                 <w:b w:val="0"/>
-                <w:sz w:val="24"/>
+                <w:sz w:val="22"/>
               </w:rPr>
               <w:t>出差时间</w:t>
             </w:r>
@@ -296,8 +271,8 @@
         </w:tc>
         <w:tc>
           <w:tcPr>
-            <w:tcW w:type="dxa" w:w="3176"/>
-            <w:gridSpan w:val="8"/>
+            <w:tcW w:type="dxa" w:w="3402"/>
+            <w:gridSpan w:val="2"/>
             <w:tcBorders>
               <w:left w:val="single" w:sz="8" w:color="BFBFBF"/>
               <w:top w:val="single" w:sz="8" w:color="BFBFBF"/>
@@ -308,7 +283,7 @@
           </w:tcPr>
           <w:p>
             <w:pPr>
-              <w:spacing w:before="0" w:after="0"/>
+              <w:spacing w:before="0" w:after="0" w:line="240" w:lineRule="auto"/>
               <w:jc w:val="center"/>
             </w:pPr>
             <w:r/>
@@ -316,7 +291,7 @@
               <w:rPr>
                 <w:rFonts w:ascii="宋体" w:hAnsi="宋体" w:eastAsia="宋体"/>
                 <w:b w:val="0"/>
-                <w:sz w:val="24"/>
+                <w:sz w:val="22"/>
               </w:rPr>
               <w:t>（{start_date}）至（{end_date}）</w:t>
             </w:r>
@@ -324,8 +299,7 @@
         </w:tc>
         <w:tc>
           <w:tcPr>
-            <w:tcW w:type="dxa" w:w="1985"/>
-            <w:gridSpan w:val="5"/>
+            <w:tcW w:type="dxa" w:w="1701"/>
             <w:tcBorders>
               <w:left w:val="single" w:sz="8" w:color="BFBFBF"/>
               <w:top w:val="single" w:sz="8" w:color="BFBFBF"/>
@@ -336,7 +310,7 @@
           </w:tcPr>
           <w:p>
             <w:pPr>
-              <w:spacing w:before="0" w:after="0"/>
+              <w:spacing w:before="0" w:after="0" w:line="240" w:lineRule="auto"/>
               <w:jc w:val="center"/>
             </w:pPr>
             <w:r/>
@@ -344,7 +318,7 @@
               <w:rPr>
                 <w:rFonts w:ascii="宋体" w:hAnsi="宋体" w:eastAsia="宋体"/>
                 <w:b w:val="0"/>
-                <w:sz w:val="24"/>
+                <w:sz w:val="22"/>
               </w:rPr>
               <w:t>天数</w:t>
             </w:r>
@@ -352,8 +326,8 @@
         </w:tc>
         <w:tc>
           <w:tcPr>
-            <w:tcW w:type="dxa" w:w="2779"/>
-            <w:gridSpan w:val="7"/>
+            <w:tcW w:type="dxa" w:w="3402"/>
+            <w:gridSpan w:val="2"/>
             <w:tcBorders>
               <w:left w:val="single" w:sz="8" w:color="BFBFBF"/>
               <w:top w:val="single" w:sz="8" w:color="BFBFBF"/>
@@ -364,7 +338,7 @@
           </w:tcPr>
           <w:p>
             <w:pPr>
-              <w:spacing w:before="0" w:after="0"/>
+              <w:spacing w:before="0" w:after="0" w:line="240" w:lineRule="auto"/>
               <w:jc w:val="left"/>
             </w:pPr>
             <w:r/>
@@ -380,12 +354,9 @@
         </w:tc>
       </w:tr>
       <w:tr>
-        <w:trPr>
-          <w:trHeight w:hRule="atLeast" w:val="595"/>
-        </w:trPr>
         <w:tc>
           <w:tcPr>
-            <w:tcW w:type="dxa" w:w="1644"/>
+            <w:tcW w:type="dxa" w:w="1587"/>
             <w:tcBorders>
               <w:left w:val="single" w:sz="8" w:color="BFBFBF"/>
               <w:top w:val="single" w:sz="8" w:color="BFBFBF"/>
@@ -396,7 +367,7 @@
           </w:tcPr>
           <w:p>
             <w:pPr>
-              <w:spacing w:before="0" w:after="0"/>
+              <w:spacing w:before="0" w:after="0" w:line="240" w:lineRule="auto"/>
               <w:jc w:val="center"/>
             </w:pPr>
             <w:r/>
@@ -404,7 +375,7 @@
               <w:rPr>
                 <w:rFonts w:ascii="宋体" w:hAnsi="宋体" w:eastAsia="宋体"/>
                 <w:b w:val="0"/>
-                <w:sz w:val="24"/>
+                <w:sz w:val="22"/>
               </w:rPr>
               <w:t>出差事由</w:t>
             </w:r>
@@ -412,8 +383,8 @@
         </w:tc>
         <w:tc>
           <w:tcPr>
-            <w:tcW w:type="dxa" w:w="3176"/>
-            <w:gridSpan w:val="8"/>
+            <w:tcW w:type="dxa" w:w="3402"/>
+            <w:gridSpan w:val="2"/>
             <w:tcBorders>
               <w:left w:val="single" w:sz="8" w:color="BFBFBF"/>
               <w:top w:val="single" w:sz="8" w:color="BFBFBF"/>
@@ -424,7 +395,7 @@
           </w:tcPr>
           <w:p>
             <w:pPr>
-              <w:spacing w:before="0" w:after="0"/>
+              <w:spacing w:before="0" w:after="0" w:line="240" w:lineRule="auto"/>
               <w:jc w:val="left"/>
             </w:pPr>
             <w:r/>
@@ -440,8 +411,7 @@
         </w:tc>
         <w:tc>
           <w:tcPr>
-            <w:tcW w:type="dxa" w:w="1985"/>
-            <w:gridSpan w:val="5"/>
+            <w:tcW w:type="dxa" w:w="1701"/>
             <w:tcBorders>
               <w:left w:val="single" w:sz="8" w:color="BFBFBF"/>
               <w:top w:val="single" w:sz="8" w:color="BFBFBF"/>
@@ -452,7 +422,7 @@
           </w:tcPr>
           <w:p>
             <w:pPr>
-              <w:spacing w:before="0" w:after="0"/>
+              <w:spacing w:before="0" w:after="0" w:line="240" w:lineRule="auto"/>
               <w:jc w:val="center"/>
             </w:pPr>
             <w:r/>
@@ -460,7 +430,7 @@
               <w:rPr>
                 <w:rFonts w:ascii="宋体" w:hAnsi="宋体" w:eastAsia="宋体"/>
                 <w:b w:val="0"/>
-                <w:sz w:val="24"/>
+                <w:sz w:val="22"/>
               </w:rPr>
               <w:t>目的地</w:t>
             </w:r>
@@ -468,8 +438,8 @@
         </w:tc>
         <w:tc>
           <w:tcPr>
-            <w:tcW w:type="dxa" w:w="2779"/>
-            <w:gridSpan w:val="7"/>
+            <w:tcW w:type="dxa" w:w="3402"/>
+            <w:gridSpan w:val="2"/>
             <w:tcBorders>
               <w:left w:val="single" w:sz="8" w:color="BFBFBF"/>
               <w:top w:val="single" w:sz="8" w:color="BFBFBF"/>
@@ -480,7 +450,7 @@
           </w:tcPr>
           <w:p>
             <w:pPr>
-              <w:spacing w:before="0" w:after="0"/>
+              <w:spacing w:before="0" w:after="0" w:line="240" w:lineRule="auto"/>
               <w:jc w:val="left"/>
             </w:pPr>
             <w:r/>
@@ -495,13 +465,106 @@
           </w:p>
         </w:tc>
       </w:tr>
+    </w:tbl>
+    <w:p>
+      <w:pPr>
+        <w:spacing w:before="200" w:after="80"/>
+      </w:pPr>
+      <w:r>
+        <w:rPr>
+          <w:rFonts w:ascii="宋体" w:hAnsi="宋体" w:eastAsia="宋体"/>
+          <w:b/>
+          <w:sz w:val="24"/>
+        </w:rPr>
+        <w:t>城市间交通方案</w:t>
+      </w:r>
+    </w:p>
+    <w:p>
+      <w:pPr>
+        <w:spacing w:before="0" w:after="80"/>
+      </w:pPr>
+      <w:r>
+        <w:rPr>
+          <w:rFonts w:ascii="宋体" w:hAnsi="宋体" w:eastAsia="宋体"/>
+          <w:sz w:val="21"/>
+        </w:rPr>
+        <w:t>支持多组交通比价。每组为同一行程下的 3 个方案，共享出发和抵达日期。</w:t>
+      </w:r>
+    </w:p>
+    <w:p>
+      <w:pPr>
+        <w:spacing w:before="0" w:after="0"/>
+      </w:pPr>
+      <w:r>
+        <w:rPr>
+          <w:rFonts w:ascii="宋体" w:hAnsi="宋体" w:eastAsia="宋体"/>
+          <w:sz w:val="2"/>
+        </w:rPr>
+        <w:t>{#transport_groups}</w:t>
+      </w:r>
+    </w:p>
+    <w:p>
+      <w:pPr>
+        <w:spacing w:before="120" w:after="80"/>
+      </w:pPr>
+      <w:r>
+        <w:rPr>
+          <w:rFonts w:ascii="宋体" w:hAnsi="宋体" w:eastAsia="宋体"/>
+          <w:b/>
+          <w:sz w:val="22"/>
+        </w:rPr>
+        <w:t>{display_title}</w:t>
+      </w:r>
+      <w:r>
+        <w:rPr>
+          <w:rFonts w:ascii="宋体" w:hAnsi="宋体" w:eastAsia="宋体"/>
+          <w:b/>
+          <w:sz w:val="22"/>
+        </w:rPr>
+        <w:t>：</w:t>
+      </w:r>
+      <w:r>
+        <w:rPr>
+          <w:rFonts w:ascii="宋体" w:hAnsi="宋体" w:eastAsia="宋体"/>
+          <w:sz w:val="22"/>
+        </w:rPr>
+        <w:t>{group_label}</w:t>
+      </w:r>
+      <w:r>
+        <w:rPr>
+          <w:rFonts w:ascii="宋体" w:hAnsi="宋体" w:eastAsia="宋体"/>
+          <w:sz w:val="22"/>
+        </w:rPr>
+        <w:t xml:space="preserve">  </w:t>
+      </w:r>
+      <w:r>
+        <w:rPr>
+          <w:rFonts w:ascii="宋体" w:hAnsi="宋体" w:eastAsia="宋体"/>
+          <w:i/>
+          <w:sz w:val="21"/>
+        </w:rPr>
+        <w:t>{best_option_note}</w:t>
+      </w:r>
+    </w:p>
+    <w:tbl>
+      <w:tblPr>
+        <w:tblStyle w:val="TableGrid"/>
+        <w:tblW w:type="auto" w:w="0"/>
+        <w:jc w:val="center"/>
+        <w:tblLayout w:type="fixed"/>
+        <w:tblLook w:firstColumn="1" w:firstRow="1" w:lastColumn="0" w:lastRow="0" w:noHBand="0" w:noVBand="1" w:val="04A0"/>
+      </w:tblPr>
+      <w:tblGrid>
+        <w:gridCol w:w="2086"/>
+        <w:gridCol w:w="2086"/>
+        <w:gridCol w:w="2086"/>
+        <w:gridCol w:w="2086"/>
+        <w:gridCol w:w="2086"/>
+      </w:tblGrid>
       <w:tr>
-        <w:trPr>
-          <w:trHeight w:hRule="atLeast" w:val="624"/>
-        </w:trPr>
         <w:tc>
           <w:tcPr>
-            <w:tcW w:type="dxa" w:w="1644"/>
+            <w:tcW w:type="dxa" w:w="1474"/>
             <w:tcBorders>
               <w:left w:val="single" w:sz="8" w:color="BFBFBF"/>
               <w:top w:val="single" w:sz="8" w:color="BFBFBF"/>
@@ -512,7 +575,7 @@
           </w:tcPr>
           <w:p>
             <w:pPr>
-              <w:spacing w:before="0" w:after="0"/>
+              <w:spacing w:before="0" w:after="0" w:line="240" w:lineRule="auto"/>
               <w:jc w:val="center"/>
             </w:pPr>
             <w:r/>
@@ -520,16 +583,15 @@
               <w:rPr>
                 <w:rFonts w:ascii="宋体" w:hAnsi="宋体" w:eastAsia="宋体"/>
                 <w:b w:val="0"/>
-                <w:sz w:val="24"/>
+                <w:sz w:val="21"/>
               </w:rPr>
-              <w:t>城市间交通方案</w:t>
+              <w:t>方案</w:t>
             </w:r>
           </w:p>
         </w:tc>
         <w:tc>
           <w:tcPr>
-            <w:tcW w:type="dxa" w:w="1588"/>
-            <w:gridSpan w:val="4"/>
+            <w:tcW w:type="dxa" w:w="1984"/>
             <w:tcBorders>
               <w:left w:val="single" w:sz="8" w:color="BFBFBF"/>
               <w:top w:val="single" w:sz="8" w:color="BFBFBF"/>
@@ -540,7 +602,7 @@
           </w:tcPr>
           <w:p>
             <w:pPr>
-              <w:spacing w:before="0" w:after="0"/>
+              <w:spacing w:before="0" w:after="0" w:line="240" w:lineRule="auto"/>
               <w:jc w:val="center"/>
             </w:pPr>
             <w:r/>
@@ -548,16 +610,15 @@
               <w:rPr>
                 <w:rFonts w:ascii="宋体" w:hAnsi="宋体" w:eastAsia="宋体"/>
                 <w:b w:val="0"/>
-                <w:sz w:val="24"/>
+                <w:sz w:val="21"/>
               </w:rPr>
-              <w:t>出发时间</w:t>
+              <w:t>出发日期</w:t>
             </w:r>
           </w:p>
         </w:tc>
         <w:tc>
           <w:tcPr>
-            <w:tcW w:type="dxa" w:w="1588"/>
-            <w:gridSpan w:val="4"/>
+            <w:tcW w:type="dxa" w:w="1984"/>
             <w:tcBorders>
               <w:left w:val="single" w:sz="8" w:color="BFBFBF"/>
               <w:top w:val="single" w:sz="8" w:color="BFBFBF"/>
@@ -568,7 +629,7 @@
           </w:tcPr>
           <w:p>
             <w:pPr>
-              <w:spacing w:before="0" w:after="0"/>
+              <w:spacing w:before="0" w:after="0" w:line="240" w:lineRule="auto"/>
               <w:jc w:val="center"/>
             </w:pPr>
             <w:r/>
@@ -576,16 +637,15 @@
               <w:rPr>
                 <w:rFonts w:ascii="宋体" w:hAnsi="宋体" w:eastAsia="宋体"/>
                 <w:b w:val="0"/>
-                <w:sz w:val="24"/>
+                <w:sz w:val="21"/>
               </w:rPr>
-              <w:t>抵达时间</w:t>
+              <w:t>抵达日期</w:t>
             </w:r>
           </w:p>
         </w:tc>
         <w:tc>
           <w:tcPr>
-            <w:tcW w:type="dxa" w:w="1588"/>
-            <w:gridSpan w:val="4"/>
+            <w:tcW w:type="dxa" w:w="1701"/>
             <w:tcBorders>
               <w:left w:val="single" w:sz="8" w:color="BFBFBF"/>
               <w:top w:val="single" w:sz="8" w:color="BFBFBF"/>
@@ -596,7 +656,7 @@
           </w:tcPr>
           <w:p>
             <w:pPr>
-              <w:spacing w:before="0" w:after="0"/>
+              <w:spacing w:before="0" w:after="0" w:line="240" w:lineRule="auto"/>
               <w:jc w:val="center"/>
             </w:pPr>
             <w:r/>
@@ -604,7 +664,7 @@
               <w:rPr>
                 <w:rFonts w:ascii="宋体" w:hAnsi="宋体" w:eastAsia="宋体"/>
                 <w:b w:val="0"/>
-                <w:sz w:val="24"/>
+                <w:sz w:val="21"/>
               </w:rPr>
               <w:t>金额</w:t>
             </w:r>
@@ -612,8 +672,7 @@
         </w:tc>
         <w:tc>
           <w:tcPr>
-            <w:tcW w:type="dxa" w:w="1588"/>
-            <w:gridSpan w:val="4"/>
+            <w:tcW w:type="dxa" w:w="2268"/>
             <w:tcBorders>
               <w:left w:val="single" w:sz="8" w:color="BFBFBF"/>
               <w:top w:val="single" w:sz="8" w:color="BFBFBF"/>
@@ -624,7 +683,7 @@
           </w:tcPr>
           <w:p>
             <w:pPr>
-              <w:spacing w:before="0" w:after="0"/>
+              <w:spacing w:before="0" w:after="0" w:line="240" w:lineRule="auto"/>
               <w:jc w:val="center"/>
             </w:pPr>
             <w:r/>
@@ -632,16 +691,17 @@
               <w:rPr>
                 <w:rFonts w:ascii="宋体" w:hAnsi="宋体" w:eastAsia="宋体"/>
                 <w:b w:val="0"/>
-                <w:sz w:val="24"/>
+                <w:sz w:val="21"/>
               </w:rPr>
-              <w:t>服务商</w:t>
+              <w:t>交通名称</w:t>
             </w:r>
           </w:p>
         </w:tc>
+      </w:tr>
+      <w:tr>
         <w:tc>
           <w:tcPr>
-            <w:tcW w:type="dxa" w:w="1588"/>
-            <w:gridSpan w:val="4"/>
+            <w:tcW w:type="dxa" w:w="1474"/>
             <w:tcBorders>
               <w:left w:val="single" w:sz="8" w:color="BFBFBF"/>
               <w:top w:val="single" w:sz="8" w:color="BFBFBF"/>
@@ -652,28 +712,23 @@
           </w:tcPr>
           <w:p>
             <w:pPr>
-              <w:spacing w:before="0" w:after="0"/>
-              <w:jc w:val="center"/>
+              <w:spacing w:before="0" w:after="0" w:line="240" w:lineRule="auto"/>
+              <w:jc w:val="left"/>
             </w:pPr>
             <w:r/>
             <w:r>
               <w:rPr>
                 <w:rFonts w:ascii="宋体" w:hAnsi="宋体" w:eastAsia="宋体"/>
                 <w:b w:val="0"/>
-                <w:sz w:val="24"/>
+                <w:sz w:val="21"/>
               </w:rPr>
-              <w:t>报价时间</w:t>
+              <w:t>{#options}{row_label}</w:t>
             </w:r>
           </w:p>
         </w:tc>
-      </w:tr>
-      <w:tr>
-        <w:trPr>
-          <w:trHeight w:hRule="atLeast" w:val="652"/>
-        </w:trPr>
         <w:tc>
           <w:tcPr>
-            <w:tcW w:type="dxa" w:w="1644"/>
+            <w:tcW w:type="dxa" w:w="1984"/>
             <w:tcBorders>
               <w:left w:val="single" w:sz="8" w:color="BFBFBF"/>
               <w:top w:val="single" w:sz="8" w:color="BFBFBF"/>
@@ -684,24 +739,23 @@
           </w:tcPr>
           <w:p>
             <w:pPr>
-              <w:spacing w:before="0" w:after="0"/>
-              <w:jc w:val="center"/>
+              <w:spacing w:before="0" w:after="0" w:line="240" w:lineRule="auto"/>
+              <w:jc w:val="left"/>
             </w:pPr>
             <w:r/>
             <w:r>
               <w:rPr>
                 <w:rFonts w:ascii="宋体" w:hAnsi="宋体" w:eastAsia="宋体"/>
                 <w:b w:val="0"/>
-                <w:sz w:val="24"/>
+                <w:sz w:val="21"/>
               </w:rPr>
-              <w:t>方案1：</w:t>
+              <w:t>{start_date}</w:t>
             </w:r>
           </w:p>
         </w:tc>
         <w:tc>
           <w:tcPr>
-            <w:tcW w:type="dxa" w:w="1588"/>
-            <w:gridSpan w:val="4"/>
+            <w:tcW w:type="dxa" w:w="1984"/>
             <w:tcBorders>
               <w:left w:val="single" w:sz="8" w:color="BFBFBF"/>
               <w:top w:val="single" w:sz="8" w:color="BFBFBF"/>
@@ -712,7 +766,7 @@
           </w:tcPr>
           <w:p>
             <w:pPr>
-              <w:spacing w:before="0" w:after="0"/>
+              <w:spacing w:before="0" w:after="0" w:line="240" w:lineRule="auto"/>
               <w:jc w:val="left"/>
             </w:pPr>
             <w:r/>
@@ -722,14 +776,13 @@
                 <w:b w:val="0"/>
                 <w:sz w:val="21"/>
               </w:rPr>
-              <w:t>{transport_1_departure}</w:t>
+              <w:t>{end_date}</w:t>
             </w:r>
           </w:p>
         </w:tc>
         <w:tc>
           <w:tcPr>
-            <w:tcW w:type="dxa" w:w="1588"/>
-            <w:gridSpan w:val="4"/>
+            <w:tcW w:type="dxa" w:w="1701"/>
             <w:tcBorders>
               <w:left w:val="single" w:sz="8" w:color="BFBFBF"/>
               <w:top w:val="single" w:sz="8" w:color="BFBFBF"/>
@@ -740,7 +793,7 @@
           </w:tcPr>
           <w:p>
             <w:pPr>
-              <w:spacing w:before="0" w:after="0"/>
+              <w:spacing w:before="0" w:after="0" w:line="240" w:lineRule="auto"/>
               <w:jc w:val="left"/>
             </w:pPr>
             <w:r/>
@@ -750,14 +803,13 @@
                 <w:b w:val="0"/>
                 <w:sz w:val="21"/>
               </w:rPr>
-              <w:t>{transport_1_arrival}</w:t>
+              <w:t>{amount}</w:t>
             </w:r>
           </w:p>
         </w:tc>
         <w:tc>
           <w:tcPr>
-            <w:tcW w:type="dxa" w:w="1588"/>
-            <w:gridSpan w:val="4"/>
+            <w:tcW w:type="dxa" w:w="2268"/>
             <w:tcBorders>
               <w:left w:val="single" w:sz="8" w:color="BFBFBF"/>
               <w:top w:val="single" w:sz="8" w:color="BFBFBF"/>
@@ -768,7 +820,7 @@
           </w:tcPr>
           <w:p>
             <w:pPr>
-              <w:spacing w:before="0" w:after="0"/>
+              <w:spacing w:before="0" w:after="0" w:line="240" w:lineRule="auto"/>
               <w:jc w:val="left"/>
             </w:pPr>
             <w:r/>
@@ -778,14 +830,123 @@
                 <w:b w:val="0"/>
                 <w:sz w:val="21"/>
               </w:rPr>
-              <w:t>{transport_1_budget}</w:t>
+              <w:t>{vendor}{/options}</w:t>
             </w:r>
           </w:p>
         </w:tc>
+      </w:tr>
+    </w:tbl>
+    <w:p>
+      <w:pPr>
+        <w:spacing w:before="0" w:after="0"/>
+      </w:pPr>
+      <w:r>
+        <w:rPr>
+          <w:rFonts w:ascii="宋体" w:hAnsi="宋体" w:eastAsia="宋体"/>
+          <w:sz w:val="2"/>
+        </w:rPr>
+        <w:t>{/transport_groups}</w:t>
+      </w:r>
+    </w:p>
+    <w:p>
+      <w:pPr>
+        <w:spacing w:before="200" w:after="80"/>
+      </w:pPr>
+      <w:r>
+        <w:rPr>
+          <w:rFonts w:ascii="宋体" w:hAnsi="宋体" w:eastAsia="宋体"/>
+          <w:b/>
+          <w:sz w:val="24"/>
+        </w:rPr>
+        <w:t>住宿方案</w:t>
+      </w:r>
+    </w:p>
+    <w:p>
+      <w:pPr>
+        <w:spacing w:before="0" w:after="80"/>
+      </w:pPr>
+      <w:r>
+        <w:rPr>
+          <w:rFonts w:ascii="宋体" w:hAnsi="宋体" w:eastAsia="宋体"/>
+          <w:sz w:val="21"/>
+        </w:rPr>
+        <w:t>支持多组住宿比价。每组为同一入住场景下的 3 个方案，共享入住和离开日期。</w:t>
+      </w:r>
+    </w:p>
+    <w:p>
+      <w:pPr>
+        <w:spacing w:before="0" w:after="0"/>
+      </w:pPr>
+      <w:r>
+        <w:rPr>
+          <w:rFonts w:ascii="宋体" w:hAnsi="宋体" w:eastAsia="宋体"/>
+          <w:sz w:val="2"/>
+        </w:rPr>
+        <w:t>{#accommodation_groups}</w:t>
+      </w:r>
+    </w:p>
+    <w:p>
+      <w:pPr>
+        <w:spacing w:before="120" w:after="80"/>
+      </w:pPr>
+      <w:r>
+        <w:rPr>
+          <w:rFonts w:ascii="宋体" w:hAnsi="宋体" w:eastAsia="宋体"/>
+          <w:b/>
+          <w:sz w:val="22"/>
+        </w:rPr>
+        <w:t>{display_title}</w:t>
+      </w:r>
+      <w:r>
+        <w:rPr>
+          <w:rFonts w:ascii="宋体" w:hAnsi="宋体" w:eastAsia="宋体"/>
+          <w:b/>
+          <w:sz w:val="22"/>
+        </w:rPr>
+        <w:t>：</w:t>
+      </w:r>
+      <w:r>
+        <w:rPr>
+          <w:rFonts w:ascii="宋体" w:hAnsi="宋体" w:eastAsia="宋体"/>
+          <w:sz w:val="22"/>
+        </w:rPr>
+        <w:t>{group_label}</w:t>
+      </w:r>
+      <w:r>
+        <w:rPr>
+          <w:rFonts w:ascii="宋体" w:hAnsi="宋体" w:eastAsia="宋体"/>
+          <w:sz w:val="22"/>
+        </w:rPr>
+        <w:t xml:space="preserve">  </w:t>
+      </w:r>
+      <w:r>
+        <w:rPr>
+          <w:rFonts w:ascii="宋体" w:hAnsi="宋体" w:eastAsia="宋体"/>
+          <w:i/>
+          <w:sz w:val="21"/>
+        </w:rPr>
+        <w:t>{best_option_note}</w:t>
+      </w:r>
+    </w:p>
+    <w:tbl>
+      <w:tblPr>
+        <w:tblStyle w:val="TableGrid"/>
+        <w:tblW w:type="auto" w:w="0"/>
+        <w:jc w:val="center"/>
+        <w:tblLayout w:type="fixed"/>
+        <w:tblLook w:firstColumn="1" w:firstRow="1" w:lastColumn="0" w:lastRow="0" w:noHBand="0" w:noVBand="1" w:val="04A0"/>
+      </w:tblPr>
+      <w:tblGrid>
+        <w:gridCol w:w="2086"/>
+        <w:gridCol w:w="2086"/>
+        <w:gridCol w:w="2086"/>
+        <w:gridCol w:w="2086"/>
+        <w:gridCol w:w="2086"/>
+      </w:tblGrid>
+      <w:tr>
         <w:tc>
           <w:tcPr>
-            <w:tcW w:type="dxa" w:w="1588"/>
-            <w:gridSpan w:val="4"/>
+            <w:tcW w:type="dxa" w:w="1474"/>
             <w:tcBorders>
               <w:left w:val="single" w:sz="8" w:color="BFBFBF"/>
               <w:top w:val="single" w:sz="8" w:color="BFBFBF"/>
@@ -796,8 +957,8 @@
           </w:tcPr>
           <w:p>
             <w:pPr>
-              <w:spacing w:before="0" w:after="0"/>
-              <w:jc w:val="left"/>
+              <w:spacing w:before="0" w:after="0" w:line="240" w:lineRule="auto"/>
+              <w:jc w:val="center"/>
             </w:pPr>
             <w:r/>
             <w:r>
@@ -806,14 +967,13 @@
                 <w:b w:val="0"/>
                 <w:sz w:val="21"/>
               </w:rPr>
-              <w:t>{transport_1_vendor}</w:t>
+              <w:t>方案</w:t>
             </w:r>
           </w:p>
         </w:tc>
         <w:tc>
           <w:tcPr>
-            <w:tcW w:type="dxa" w:w="1588"/>
-            <w:gridSpan w:val="4"/>
+            <w:tcW w:type="dxa" w:w="1984"/>
             <w:tcBorders>
               <w:left w:val="single" w:sz="8" w:color="BFBFBF"/>
               <w:top w:val="single" w:sz="8" w:color="BFBFBF"/>
@@ -824,8 +984,8 @@
           </w:tcPr>
           <w:p>
             <w:pPr>
-              <w:spacing w:before="0" w:after="0"/>
-              <w:jc w:val="left"/>
+              <w:spacing w:before="0" w:after="0" w:line="240" w:lineRule="auto"/>
+              <w:jc w:val="center"/>
             </w:pPr>
             <w:r/>
             <w:r>
@@ -834,18 +994,13 @@
                 <w:b w:val="0"/>
                 <w:sz w:val="21"/>
               </w:rPr>
-              <w:t>{transport_1_quote_at}</w:t>
+              <w:t>入住日期</w:t>
             </w:r>
           </w:p>
         </w:tc>
-      </w:tr>
-      <w:tr>
-        <w:trPr>
-          <w:trHeight w:hRule="atLeast" w:val="652"/>
-        </w:trPr>
         <w:tc>
           <w:tcPr>
-            <w:tcW w:type="dxa" w:w="1644"/>
+            <w:tcW w:type="dxa" w:w="1984"/>
             <w:tcBorders>
               <w:left w:val="single" w:sz="8" w:color="BFBFBF"/>
               <w:top w:val="single" w:sz="8" w:color="BFBFBF"/>
@@ -856,7 +1011,7 @@
           </w:tcPr>
           <w:p>
             <w:pPr>
-              <w:spacing w:before="0" w:after="0"/>
+              <w:spacing w:before="0" w:after="0" w:line="240" w:lineRule="auto"/>
               <w:jc w:val="center"/>
             </w:pPr>
             <w:r/>
@@ -864,16 +1019,15 @@
               <w:rPr>
                 <w:rFonts w:ascii="宋体" w:hAnsi="宋体" w:eastAsia="宋体"/>
                 <w:b w:val="0"/>
-                <w:sz w:val="24"/>
+                <w:sz w:val="21"/>
               </w:rPr>
-              <w:t>方案2：</w:t>
+              <w:t>离开日期</w:t>
             </w:r>
           </w:p>
         </w:tc>
         <w:tc>
           <w:tcPr>
-            <w:tcW w:type="dxa" w:w="1588"/>
-            <w:gridSpan w:val="4"/>
+            <w:tcW w:type="dxa" w:w="1701"/>
             <w:tcBorders>
               <w:left w:val="single" w:sz="8" w:color="BFBFBF"/>
               <w:top w:val="single" w:sz="8" w:color="BFBFBF"/>
@@ -884,8 +1038,8 @@
           </w:tcPr>
           <w:p>
             <w:pPr>
-              <w:spacing w:before="0" w:after="0"/>
-              <w:jc w:val="left"/>
+              <w:spacing w:before="0" w:after="0" w:line="240" w:lineRule="auto"/>
+              <w:jc w:val="center"/>
             </w:pPr>
             <w:r/>
             <w:r>
@@ -894,14 +1048,13 @@
                 <w:b w:val="0"/>
                 <w:sz w:val="21"/>
               </w:rPr>
-              <w:t>{transport_2_departure}</w:t>
+              <w:t>金额</w:t>
             </w:r>
           </w:p>
         </w:tc>
         <w:tc>
           <w:tcPr>
-            <w:tcW w:type="dxa" w:w="1588"/>
-            <w:gridSpan w:val="4"/>
+            <w:tcW w:type="dxa" w:w="2268"/>
             <w:tcBorders>
               <w:left w:val="single" w:sz="8" w:color="BFBFBF"/>
               <w:top w:val="single" w:sz="8" w:color="BFBFBF"/>
@@ -912,8 +1065,8 @@
           </w:tcPr>
           <w:p>
             <w:pPr>
-              <w:spacing w:before="0" w:after="0"/>
-              <w:jc w:val="left"/>
+              <w:spacing w:before="0" w:after="0" w:line="240" w:lineRule="auto"/>
+              <w:jc w:val="center"/>
             </w:pPr>
             <w:r/>
             <w:r>
@@ -922,14 +1075,15 @@
                 <w:b w:val="0"/>
                 <w:sz w:val="21"/>
               </w:rPr>
-              <w:t>{transport_2_arrival}</w:t>
+              <w:t>酒店名称</w:t>
             </w:r>
           </w:p>
         </w:tc>
+      </w:tr>
+      <w:tr>
         <w:tc>
           <w:tcPr>
-            <w:tcW w:type="dxa" w:w="1588"/>
-            <w:gridSpan w:val="4"/>
+            <w:tcW w:type="dxa" w:w="1474"/>
             <w:tcBorders>
               <w:left w:val="single" w:sz="8" w:color="BFBFBF"/>
               <w:top w:val="single" w:sz="8" w:color="BFBFBF"/>
@@ -940,7 +1094,7 @@
           </w:tcPr>
           <w:p>
             <w:pPr>
-              <w:spacing w:before="0" w:after="0"/>
+              <w:spacing w:before="0" w:after="0" w:line="240" w:lineRule="auto"/>
               <w:jc w:val="left"/>
             </w:pPr>
             <w:r/>
@@ -950,14 +1104,13 @@
                 <w:b w:val="0"/>
                 <w:sz w:val="21"/>
               </w:rPr>
-              <w:t>{transport_2_budget}</w:t>
+              <w:t>{#options}{row_label}</w:t>
             </w:r>
           </w:p>
         </w:tc>
         <w:tc>
           <w:tcPr>
-            <w:tcW w:type="dxa" w:w="1588"/>
-            <w:gridSpan w:val="4"/>
+            <w:tcW w:type="dxa" w:w="1984"/>
             <w:tcBorders>
               <w:left w:val="single" w:sz="8" w:color="BFBFBF"/>
               <w:top w:val="single" w:sz="8" w:color="BFBFBF"/>
@@ -968,7 +1121,7 @@
           </w:tcPr>
           <w:p>
             <w:pPr>
-              <w:spacing w:before="0" w:after="0"/>
+              <w:spacing w:before="0" w:after="0" w:line="240" w:lineRule="auto"/>
               <w:jc w:val="left"/>
             </w:pPr>
             <w:r/>
@@ -978,14 +1131,13 @@
                 <w:b w:val="0"/>
                 <w:sz w:val="21"/>
               </w:rPr>
-              <w:t>{transport_2_vendor}</w:t>
+              <w:t>{start_date}</w:t>
             </w:r>
           </w:p>
         </w:tc>
         <w:tc>
           <w:tcPr>
-            <w:tcW w:type="dxa" w:w="1588"/>
-            <w:gridSpan w:val="4"/>
+            <w:tcW w:type="dxa" w:w="1984"/>
             <w:tcBorders>
               <w:left w:val="single" w:sz="8" w:color="BFBFBF"/>
               <w:top w:val="single" w:sz="8" w:color="BFBFBF"/>
@@ -996,7 +1148,7 @@
           </w:tcPr>
           <w:p>
             <w:pPr>
-              <w:spacing w:before="0" w:after="0"/>
+              <w:spacing w:before="0" w:after="0" w:line="240" w:lineRule="auto"/>
               <w:jc w:val="left"/>
             </w:pPr>
             <w:r/>
@@ -1006,18 +1158,13 @@
                 <w:b w:val="0"/>
                 <w:sz w:val="21"/>
               </w:rPr>
-              <w:t>{transport_2_quote_at}</w:t>
+              <w:t>{end_date}</w:t>
             </w:r>
           </w:p>
         </w:tc>
-      </w:tr>
-      <w:tr>
-        <w:trPr>
-          <w:trHeight w:hRule="atLeast" w:val="652"/>
-        </w:trPr>
         <w:tc>
           <w:tcPr>
-            <w:tcW w:type="dxa" w:w="1644"/>
+            <w:tcW w:type="dxa" w:w="1701"/>
             <w:tcBorders>
               <w:left w:val="single" w:sz="8" w:color="BFBFBF"/>
               <w:top w:val="single" w:sz="8" w:color="BFBFBF"/>
@@ -1028,24 +1175,23 @@
           </w:tcPr>
           <w:p>
             <w:pPr>
-              <w:spacing w:before="0" w:after="0"/>
-              <w:jc w:val="center"/>
+              <w:spacing w:before="0" w:after="0" w:line="240" w:lineRule="auto"/>
+              <w:jc w:val="left"/>
             </w:pPr>
             <w:r/>
             <w:r>
               <w:rPr>
                 <w:rFonts w:ascii="宋体" w:hAnsi="宋体" w:eastAsia="宋体"/>
                 <w:b w:val="0"/>
-                <w:sz w:val="24"/>
+                <w:sz w:val="21"/>
               </w:rPr>
-              <w:t>方案3：</w:t>
+              <w:t>{amount}</w:t>
             </w:r>
           </w:p>
         </w:tc>
         <w:tc>
           <w:tcPr>
-            <w:tcW w:type="dxa" w:w="1588"/>
-            <w:gridSpan w:val="4"/>
+            <w:tcW w:type="dxa" w:w="2268"/>
             <w:tcBorders>
               <w:left w:val="single" w:sz="8" w:color="BFBFBF"/>
               <w:top w:val="single" w:sz="8" w:color="BFBFBF"/>
@@ -1056,7 +1202,7 @@
           </w:tcPr>
           <w:p>
             <w:pPr>
-              <w:spacing w:before="0" w:after="0"/>
+              <w:spacing w:before="0" w:after="0" w:line="240" w:lineRule="auto"/>
               <w:jc w:val="left"/>
             </w:pPr>
             <w:r/>
@@ -1066,14 +1212,69 @@
                 <w:b w:val="0"/>
                 <w:sz w:val="21"/>
               </w:rPr>
-              <w:t>{transport_3_departure}</w:t>
+              <w:t>{vendor}{/options}</w:t>
             </w:r>
           </w:p>
         </w:tc>
+      </w:tr>
+    </w:tbl>
+    <w:p>
+      <w:pPr>
+        <w:spacing w:before="0" w:after="0"/>
+      </w:pPr>
+      <w:r>
+        <w:rPr>
+          <w:rFonts w:ascii="宋体" w:hAnsi="宋体" w:eastAsia="宋体"/>
+          <w:sz w:val="2"/>
+        </w:rPr>
+        <w:t>{/accommodation_groups}</w:t>
+      </w:r>
+    </w:p>
+    <w:p>
+      <w:pPr>
+        <w:spacing w:before="200" w:after="80"/>
+      </w:pPr>
+      <w:r>
+        <w:rPr>
+          <w:rFonts w:ascii="宋体" w:hAnsi="宋体" w:eastAsia="宋体"/>
+          <w:b/>
+          <w:sz w:val="24"/>
+        </w:rPr>
+        <w:t>费用汇总</w:t>
+      </w:r>
+    </w:p>
+    <w:p>
+      <w:pPr>
+        <w:spacing w:before="0" w:after="80"/>
+      </w:pPr>
+      <w:r>
+        <w:rPr>
+          <w:rFonts w:ascii="宋体" w:hAnsi="宋体" w:eastAsia="宋体"/>
+          <w:sz w:val="21"/>
+        </w:rPr>
+        <w:t>系统会根据当前申请类型自动汇总预算或实际金额。</w:t>
+      </w:r>
+    </w:p>
+    <w:tbl>
+      <w:tblPr>
+        <w:tblStyle w:val="TableGrid"/>
+        <w:tblW w:type="auto" w:w="0"/>
+        <w:jc w:val="center"/>
+        <w:tblLayout w:type="fixed"/>
+        <w:tblLook w:firstColumn="1" w:firstRow="1" w:lastColumn="0" w:lastRow="0" w:noHBand="0" w:noVBand="1" w:val="04A0"/>
+      </w:tblPr>
+      <w:tblGrid>
+        <w:gridCol w:w="1739"/>
+        <w:gridCol w:w="1739"/>
+        <w:gridCol w:w="1739"/>
+        <w:gridCol w:w="1739"/>
+        <w:gridCol w:w="1739"/>
+        <w:gridCol w:w="1739"/>
+      </w:tblGrid>
+      <w:tr>
         <w:tc>
           <w:tcPr>
-            <w:tcW w:type="dxa" w:w="1588"/>
-            <w:gridSpan w:val="4"/>
+            <w:tcW w:type="dxa" w:w="1587"/>
             <w:tcBorders>
               <w:left w:val="single" w:sz="8" w:color="BFBFBF"/>
               <w:top w:val="single" w:sz="8" w:color="BFBFBF"/>
@@ -1084,24 +1285,24 @@
           </w:tcPr>
           <w:p>
             <w:pPr>
-              <w:spacing w:before="0" w:after="0"/>
-              <w:jc w:val="left"/>
+              <w:spacing w:before="0" w:after="0" w:line="240" w:lineRule="auto"/>
+              <w:jc w:val="center"/>
             </w:pPr>
             <w:r/>
             <w:r>
               <w:rPr>
                 <w:rFonts w:ascii="宋体" w:hAnsi="宋体" w:eastAsia="宋体"/>
                 <w:b w:val="0"/>
-                <w:sz w:val="21"/>
+                <w:sz w:val="22"/>
               </w:rPr>
-              <w:t>{transport_3_arrival}</w:t>
+              <w:t>餐费总支出</w:t>
             </w:r>
           </w:p>
         </w:tc>
         <w:tc>
           <w:tcPr>
-            <w:tcW w:type="dxa" w:w="1588"/>
-            <w:gridSpan w:val="4"/>
+            <w:tcW w:type="dxa" w:w="3402"/>
+            <w:gridSpan w:val="2"/>
             <w:tcBorders>
               <w:left w:val="single" w:sz="8" w:color="BFBFBF"/>
               <w:top w:val="single" w:sz="8" w:color="BFBFBF"/>
@@ -1112,811 +1313,7 @@
           </w:tcPr>
           <w:p>
             <w:pPr>
-              <w:spacing w:before="0" w:after="0"/>
-              <w:jc w:val="left"/>
-            </w:pPr>
-            <w:r/>
-            <w:r>
-              <w:rPr>
-                <w:rFonts w:ascii="宋体" w:hAnsi="宋体" w:eastAsia="宋体"/>
-                <w:b w:val="0"/>
-                <w:sz w:val="21"/>
-              </w:rPr>
-              <w:t>{transport_3_budget}</w:t>
-            </w:r>
-          </w:p>
-        </w:tc>
-        <w:tc>
-          <w:tcPr>
-            <w:tcW w:type="dxa" w:w="1588"/>
-            <w:gridSpan w:val="4"/>
-            <w:tcBorders>
-              <w:left w:val="single" w:sz="8" w:color="BFBFBF"/>
-              <w:top w:val="single" w:sz="8" w:color="BFBFBF"/>
-              <w:right w:val="single" w:sz="8" w:color="BFBFBF"/>
-              <w:bottom w:val="single" w:sz="8" w:color="BFBFBF"/>
-            </w:tcBorders>
-            <w:vAlign w:val="center"/>
-          </w:tcPr>
-          <w:p>
-            <w:pPr>
-              <w:spacing w:before="0" w:after="0"/>
-              <w:jc w:val="left"/>
-            </w:pPr>
-            <w:r/>
-            <w:r>
-              <w:rPr>
-                <w:rFonts w:ascii="宋体" w:hAnsi="宋体" w:eastAsia="宋体"/>
-                <w:b w:val="0"/>
-                <w:sz w:val="21"/>
-              </w:rPr>
-              <w:t>{transport_3_vendor}</w:t>
-            </w:r>
-          </w:p>
-        </w:tc>
-        <w:tc>
-          <w:tcPr>
-            <w:tcW w:type="dxa" w:w="1588"/>
-            <w:gridSpan w:val="4"/>
-            <w:tcBorders>
-              <w:left w:val="single" w:sz="8" w:color="BFBFBF"/>
-              <w:top w:val="single" w:sz="8" w:color="BFBFBF"/>
-              <w:right w:val="single" w:sz="8" w:color="BFBFBF"/>
-              <w:bottom w:val="single" w:sz="8" w:color="BFBFBF"/>
-            </w:tcBorders>
-            <w:vAlign w:val="center"/>
-          </w:tcPr>
-          <w:p>
-            <w:pPr>
-              <w:spacing w:before="0" w:after="0"/>
-              <w:jc w:val="left"/>
-            </w:pPr>
-            <w:r/>
-            <w:r>
-              <w:rPr>
-                <w:rFonts w:ascii="宋体" w:hAnsi="宋体" w:eastAsia="宋体"/>
-                <w:b w:val="0"/>
-                <w:sz w:val="21"/>
-              </w:rPr>
-              <w:t>{transport_3_quote_at}</w:t>
-            </w:r>
-          </w:p>
-        </w:tc>
-      </w:tr>
-      <w:tr>
-        <w:trPr>
-          <w:trHeight w:hRule="atLeast" w:val="624"/>
-        </w:trPr>
-        <w:tc>
-          <w:tcPr>
-            <w:tcW w:type="dxa" w:w="1644"/>
-            <w:tcBorders>
-              <w:left w:val="single" w:sz="8" w:color="BFBFBF"/>
-              <w:top w:val="single" w:sz="8" w:color="BFBFBF"/>
-              <w:right w:val="single" w:sz="8" w:color="BFBFBF"/>
-              <w:bottom w:val="single" w:sz="8" w:color="BFBFBF"/>
-            </w:tcBorders>
-            <w:vAlign w:val="center"/>
-          </w:tcPr>
-          <w:p>
-            <w:pPr>
-              <w:spacing w:before="0" w:after="0"/>
-              <w:jc w:val="center"/>
-            </w:pPr>
-            <w:r/>
-            <w:r>
-              <w:rPr>
-                <w:rFonts w:ascii="宋体" w:hAnsi="宋体" w:eastAsia="宋体"/>
-                <w:b w:val="0"/>
-                <w:sz w:val="24"/>
-              </w:rPr>
-              <w:t>住宿方案</w:t>
-            </w:r>
-          </w:p>
-        </w:tc>
-        <w:tc>
-          <w:tcPr>
-            <w:tcW w:type="dxa" w:w="1588"/>
-            <w:gridSpan w:val="4"/>
-            <w:tcBorders>
-              <w:left w:val="single" w:sz="8" w:color="BFBFBF"/>
-              <w:top w:val="single" w:sz="8" w:color="BFBFBF"/>
-              <w:right w:val="single" w:sz="8" w:color="BFBFBF"/>
-              <w:bottom w:val="single" w:sz="8" w:color="BFBFBF"/>
-            </w:tcBorders>
-            <w:vAlign w:val="center"/>
-          </w:tcPr>
-          <w:p>
-            <w:pPr>
-              <w:spacing w:before="0" w:after="0"/>
-              <w:jc w:val="center"/>
-            </w:pPr>
-            <w:r/>
-            <w:r>
-              <w:rPr>
-                <w:rFonts w:ascii="宋体" w:hAnsi="宋体" w:eastAsia="宋体"/>
-                <w:b w:val="0"/>
-                <w:sz w:val="24"/>
-              </w:rPr>
-              <w:t>入住时间</w:t>
-            </w:r>
-          </w:p>
-        </w:tc>
-        <w:tc>
-          <w:tcPr>
-            <w:tcW w:type="dxa" w:w="1588"/>
-            <w:gridSpan w:val="4"/>
-            <w:tcBorders>
-              <w:left w:val="single" w:sz="8" w:color="BFBFBF"/>
-              <w:top w:val="single" w:sz="8" w:color="BFBFBF"/>
-              <w:right w:val="single" w:sz="8" w:color="BFBFBF"/>
-              <w:bottom w:val="single" w:sz="8" w:color="BFBFBF"/>
-            </w:tcBorders>
-            <w:vAlign w:val="center"/>
-          </w:tcPr>
-          <w:p>
-            <w:pPr>
-              <w:spacing w:before="0" w:after="0"/>
-              <w:jc w:val="center"/>
-            </w:pPr>
-            <w:r/>
-            <w:r>
-              <w:rPr>
-                <w:rFonts w:ascii="宋体" w:hAnsi="宋体" w:eastAsia="宋体"/>
-                <w:b w:val="0"/>
-                <w:sz w:val="24"/>
-              </w:rPr>
-              <w:t>退房时间</w:t>
-            </w:r>
-          </w:p>
-        </w:tc>
-        <w:tc>
-          <w:tcPr>
-            <w:tcW w:type="dxa" w:w="1588"/>
-            <w:gridSpan w:val="4"/>
-            <w:tcBorders>
-              <w:left w:val="single" w:sz="8" w:color="BFBFBF"/>
-              <w:top w:val="single" w:sz="8" w:color="BFBFBF"/>
-              <w:right w:val="single" w:sz="8" w:color="BFBFBF"/>
-              <w:bottom w:val="single" w:sz="8" w:color="BFBFBF"/>
-            </w:tcBorders>
-            <w:vAlign w:val="center"/>
-          </w:tcPr>
-          <w:p>
-            <w:pPr>
-              <w:spacing w:before="0" w:after="0"/>
-              <w:jc w:val="center"/>
-            </w:pPr>
-            <w:r/>
-            <w:r>
-              <w:rPr>
-                <w:rFonts w:ascii="宋体" w:hAnsi="宋体" w:eastAsia="宋体"/>
-                <w:b w:val="0"/>
-                <w:sz w:val="24"/>
-              </w:rPr>
-              <w:t>金额</w:t>
-            </w:r>
-          </w:p>
-        </w:tc>
-        <w:tc>
-          <w:tcPr>
-            <w:tcW w:type="dxa" w:w="1588"/>
-            <w:gridSpan w:val="4"/>
-            <w:tcBorders>
-              <w:left w:val="single" w:sz="8" w:color="BFBFBF"/>
-              <w:top w:val="single" w:sz="8" w:color="BFBFBF"/>
-              <w:right w:val="single" w:sz="8" w:color="BFBFBF"/>
-              <w:bottom w:val="single" w:sz="8" w:color="BFBFBF"/>
-            </w:tcBorders>
-            <w:vAlign w:val="center"/>
-          </w:tcPr>
-          <w:p>
-            <w:pPr>
-              <w:spacing w:before="0" w:after="0"/>
-              <w:jc w:val="center"/>
-            </w:pPr>
-            <w:r/>
-            <w:r>
-              <w:rPr>
-                <w:rFonts w:ascii="宋体" w:hAnsi="宋体" w:eastAsia="宋体"/>
-                <w:b w:val="0"/>
-                <w:sz w:val="24"/>
-              </w:rPr>
-              <w:t>服务商</w:t>
-            </w:r>
-          </w:p>
-        </w:tc>
-        <w:tc>
-          <w:tcPr>
-            <w:tcW w:type="dxa" w:w="1588"/>
-            <w:gridSpan w:val="4"/>
-            <w:tcBorders>
-              <w:left w:val="single" w:sz="8" w:color="BFBFBF"/>
-              <w:top w:val="single" w:sz="8" w:color="BFBFBF"/>
-              <w:right w:val="single" w:sz="8" w:color="BFBFBF"/>
-              <w:bottom w:val="single" w:sz="8" w:color="BFBFBF"/>
-            </w:tcBorders>
-            <w:vAlign w:val="center"/>
-          </w:tcPr>
-          <w:p>
-            <w:pPr>
-              <w:spacing w:before="0" w:after="0"/>
-              <w:jc w:val="center"/>
-            </w:pPr>
-            <w:r/>
-            <w:r>
-              <w:rPr>
-                <w:rFonts w:ascii="宋体" w:hAnsi="宋体" w:eastAsia="宋体"/>
-                <w:b w:val="0"/>
-                <w:sz w:val="24"/>
-              </w:rPr>
-              <w:t>报价时间</w:t>
-            </w:r>
-          </w:p>
-        </w:tc>
-      </w:tr>
-      <w:tr>
-        <w:trPr>
-          <w:trHeight w:hRule="atLeast" w:val="652"/>
-        </w:trPr>
-        <w:tc>
-          <w:tcPr>
-            <w:tcW w:type="dxa" w:w="1644"/>
-            <w:tcBorders>
-              <w:left w:val="single" w:sz="8" w:color="BFBFBF"/>
-              <w:top w:val="single" w:sz="8" w:color="BFBFBF"/>
-              <w:right w:val="single" w:sz="8" w:color="BFBFBF"/>
-              <w:bottom w:val="single" w:sz="8" w:color="BFBFBF"/>
-            </w:tcBorders>
-            <w:vAlign w:val="center"/>
-          </w:tcPr>
-          <w:p>
-            <w:pPr>
-              <w:spacing w:before="0" w:after="0"/>
-              <w:jc w:val="center"/>
-            </w:pPr>
-            <w:r/>
-            <w:r>
-              <w:rPr>
-                <w:rFonts w:ascii="宋体" w:hAnsi="宋体" w:eastAsia="宋体"/>
-                <w:b w:val="0"/>
-                <w:sz w:val="24"/>
-              </w:rPr>
-              <w:t>方案1：</w:t>
-            </w:r>
-          </w:p>
-        </w:tc>
-        <w:tc>
-          <w:tcPr>
-            <w:tcW w:type="dxa" w:w="1588"/>
-            <w:gridSpan w:val="4"/>
-            <w:tcBorders>
-              <w:left w:val="single" w:sz="8" w:color="BFBFBF"/>
-              <w:top w:val="single" w:sz="8" w:color="BFBFBF"/>
-              <w:right w:val="single" w:sz="8" w:color="BFBFBF"/>
-              <w:bottom w:val="single" w:sz="8" w:color="BFBFBF"/>
-            </w:tcBorders>
-            <w:vAlign w:val="center"/>
-          </w:tcPr>
-          <w:p>
-            <w:pPr>
-              <w:spacing w:before="0" w:after="0"/>
-              <w:jc w:val="left"/>
-            </w:pPr>
-            <w:r/>
-            <w:r>
-              <w:rPr>
-                <w:rFonts w:ascii="宋体" w:hAnsi="宋体" w:eastAsia="宋体"/>
-                <w:b w:val="0"/>
-                <w:sz w:val="21"/>
-              </w:rPr>
-              <w:t>{hotel_1_check_in}</w:t>
-            </w:r>
-          </w:p>
-        </w:tc>
-        <w:tc>
-          <w:tcPr>
-            <w:tcW w:type="dxa" w:w="1588"/>
-            <w:gridSpan w:val="4"/>
-            <w:tcBorders>
-              <w:left w:val="single" w:sz="8" w:color="BFBFBF"/>
-              <w:top w:val="single" w:sz="8" w:color="BFBFBF"/>
-              <w:right w:val="single" w:sz="8" w:color="BFBFBF"/>
-              <w:bottom w:val="single" w:sz="8" w:color="BFBFBF"/>
-            </w:tcBorders>
-            <w:vAlign w:val="center"/>
-          </w:tcPr>
-          <w:p>
-            <w:pPr>
-              <w:spacing w:before="0" w:after="0"/>
-              <w:jc w:val="left"/>
-            </w:pPr>
-            <w:r/>
-            <w:r>
-              <w:rPr>
-                <w:rFonts w:ascii="宋体" w:hAnsi="宋体" w:eastAsia="宋体"/>
-                <w:b w:val="0"/>
-                <w:sz w:val="21"/>
-              </w:rPr>
-              <w:t>{hotel_1_check_out}</w:t>
-            </w:r>
-          </w:p>
-        </w:tc>
-        <w:tc>
-          <w:tcPr>
-            <w:tcW w:type="dxa" w:w="1588"/>
-            <w:gridSpan w:val="4"/>
-            <w:tcBorders>
-              <w:left w:val="single" w:sz="8" w:color="BFBFBF"/>
-              <w:top w:val="single" w:sz="8" w:color="BFBFBF"/>
-              <w:right w:val="single" w:sz="8" w:color="BFBFBF"/>
-              <w:bottom w:val="single" w:sz="8" w:color="BFBFBF"/>
-            </w:tcBorders>
-            <w:vAlign w:val="center"/>
-          </w:tcPr>
-          <w:p>
-            <w:pPr>
-              <w:spacing w:before="0" w:after="0"/>
-              <w:jc w:val="left"/>
-            </w:pPr>
-            <w:r/>
-            <w:r>
-              <w:rPr>
-                <w:rFonts w:ascii="宋体" w:hAnsi="宋体" w:eastAsia="宋体"/>
-                <w:b w:val="0"/>
-                <w:sz w:val="21"/>
-              </w:rPr>
-              <w:t>{hotel_1_budget}</w:t>
-            </w:r>
-          </w:p>
-        </w:tc>
-        <w:tc>
-          <w:tcPr>
-            <w:tcW w:type="dxa" w:w="1588"/>
-            <w:gridSpan w:val="4"/>
-            <w:tcBorders>
-              <w:left w:val="single" w:sz="8" w:color="BFBFBF"/>
-              <w:top w:val="single" w:sz="8" w:color="BFBFBF"/>
-              <w:right w:val="single" w:sz="8" w:color="BFBFBF"/>
-              <w:bottom w:val="single" w:sz="8" w:color="BFBFBF"/>
-            </w:tcBorders>
-            <w:vAlign w:val="center"/>
-          </w:tcPr>
-          <w:p>
-            <w:pPr>
-              <w:spacing w:before="0" w:after="0"/>
-              <w:jc w:val="left"/>
-            </w:pPr>
-            <w:r/>
-            <w:r>
-              <w:rPr>
-                <w:rFonts w:ascii="宋体" w:hAnsi="宋体" w:eastAsia="宋体"/>
-                <w:b w:val="0"/>
-                <w:sz w:val="21"/>
-              </w:rPr>
-              <w:t>{hotel_1_vendor}</w:t>
-            </w:r>
-          </w:p>
-        </w:tc>
-        <w:tc>
-          <w:tcPr>
-            <w:tcW w:type="dxa" w:w="1588"/>
-            <w:gridSpan w:val="4"/>
-            <w:tcBorders>
-              <w:left w:val="single" w:sz="8" w:color="BFBFBF"/>
-              <w:top w:val="single" w:sz="8" w:color="BFBFBF"/>
-              <w:right w:val="single" w:sz="8" w:color="BFBFBF"/>
-              <w:bottom w:val="single" w:sz="8" w:color="BFBFBF"/>
-            </w:tcBorders>
-            <w:vAlign w:val="center"/>
-          </w:tcPr>
-          <w:p>
-            <w:pPr>
-              <w:spacing w:before="0" w:after="0"/>
-              <w:jc w:val="left"/>
-            </w:pPr>
-            <w:r/>
-            <w:r>
-              <w:rPr>
-                <w:rFonts w:ascii="宋体" w:hAnsi="宋体" w:eastAsia="宋体"/>
-                <w:b w:val="0"/>
-                <w:sz w:val="21"/>
-              </w:rPr>
-              <w:t>{hotel_1_quote_at}</w:t>
-            </w:r>
-          </w:p>
-        </w:tc>
-      </w:tr>
-      <w:tr>
-        <w:trPr>
-          <w:trHeight w:hRule="atLeast" w:val="652"/>
-        </w:trPr>
-        <w:tc>
-          <w:tcPr>
-            <w:tcW w:type="dxa" w:w="1644"/>
-            <w:tcBorders>
-              <w:left w:val="single" w:sz="8" w:color="BFBFBF"/>
-              <w:top w:val="single" w:sz="8" w:color="BFBFBF"/>
-              <w:right w:val="single" w:sz="8" w:color="BFBFBF"/>
-              <w:bottom w:val="single" w:sz="8" w:color="BFBFBF"/>
-            </w:tcBorders>
-            <w:vAlign w:val="center"/>
-          </w:tcPr>
-          <w:p>
-            <w:pPr>
-              <w:spacing w:before="0" w:after="0"/>
-              <w:jc w:val="center"/>
-            </w:pPr>
-            <w:r/>
-            <w:r>
-              <w:rPr>
-                <w:rFonts w:ascii="宋体" w:hAnsi="宋体" w:eastAsia="宋体"/>
-                <w:b w:val="0"/>
-                <w:sz w:val="24"/>
-              </w:rPr>
-              <w:t>方案2：</w:t>
-            </w:r>
-          </w:p>
-        </w:tc>
-        <w:tc>
-          <w:tcPr>
-            <w:tcW w:type="dxa" w:w="1588"/>
-            <w:gridSpan w:val="4"/>
-            <w:tcBorders>
-              <w:left w:val="single" w:sz="8" w:color="BFBFBF"/>
-              <w:top w:val="single" w:sz="8" w:color="BFBFBF"/>
-              <w:right w:val="single" w:sz="8" w:color="BFBFBF"/>
-              <w:bottom w:val="single" w:sz="8" w:color="BFBFBF"/>
-            </w:tcBorders>
-            <w:vAlign w:val="center"/>
-          </w:tcPr>
-          <w:p>
-            <w:pPr>
-              <w:spacing w:before="0" w:after="0"/>
-              <w:jc w:val="left"/>
-            </w:pPr>
-            <w:r/>
-            <w:r>
-              <w:rPr>
-                <w:rFonts w:ascii="宋体" w:hAnsi="宋体" w:eastAsia="宋体"/>
-                <w:b w:val="0"/>
-                <w:sz w:val="21"/>
-              </w:rPr>
-              <w:t>{hotel_2_check_in}</w:t>
-            </w:r>
-          </w:p>
-        </w:tc>
-        <w:tc>
-          <w:tcPr>
-            <w:tcW w:type="dxa" w:w="1588"/>
-            <w:gridSpan w:val="4"/>
-            <w:tcBorders>
-              <w:left w:val="single" w:sz="8" w:color="BFBFBF"/>
-              <w:top w:val="single" w:sz="8" w:color="BFBFBF"/>
-              <w:right w:val="single" w:sz="8" w:color="BFBFBF"/>
-              <w:bottom w:val="single" w:sz="8" w:color="BFBFBF"/>
-            </w:tcBorders>
-            <w:vAlign w:val="center"/>
-          </w:tcPr>
-          <w:p>
-            <w:pPr>
-              <w:spacing w:before="0" w:after="0"/>
-              <w:jc w:val="left"/>
-            </w:pPr>
-            <w:r/>
-            <w:r>
-              <w:rPr>
-                <w:rFonts w:ascii="宋体" w:hAnsi="宋体" w:eastAsia="宋体"/>
-                <w:b w:val="0"/>
-                <w:sz w:val="21"/>
-              </w:rPr>
-              <w:t>{hotel_2_check_out}</w:t>
-            </w:r>
-          </w:p>
-        </w:tc>
-        <w:tc>
-          <w:tcPr>
-            <w:tcW w:type="dxa" w:w="1588"/>
-            <w:gridSpan w:val="4"/>
-            <w:tcBorders>
-              <w:left w:val="single" w:sz="8" w:color="BFBFBF"/>
-              <w:top w:val="single" w:sz="8" w:color="BFBFBF"/>
-              <w:right w:val="single" w:sz="8" w:color="BFBFBF"/>
-              <w:bottom w:val="single" w:sz="8" w:color="BFBFBF"/>
-            </w:tcBorders>
-            <w:vAlign w:val="center"/>
-          </w:tcPr>
-          <w:p>
-            <w:pPr>
-              <w:spacing w:before="0" w:after="0"/>
-              <w:jc w:val="left"/>
-            </w:pPr>
-            <w:r/>
-            <w:r>
-              <w:rPr>
-                <w:rFonts w:ascii="宋体" w:hAnsi="宋体" w:eastAsia="宋体"/>
-                <w:b w:val="0"/>
-                <w:sz w:val="21"/>
-              </w:rPr>
-              <w:t>{hotel_2_budget}</w:t>
-            </w:r>
-          </w:p>
-        </w:tc>
-        <w:tc>
-          <w:tcPr>
-            <w:tcW w:type="dxa" w:w="1588"/>
-            <w:gridSpan w:val="4"/>
-            <w:tcBorders>
-              <w:left w:val="single" w:sz="8" w:color="BFBFBF"/>
-              <w:top w:val="single" w:sz="8" w:color="BFBFBF"/>
-              <w:right w:val="single" w:sz="8" w:color="BFBFBF"/>
-              <w:bottom w:val="single" w:sz="8" w:color="BFBFBF"/>
-            </w:tcBorders>
-            <w:vAlign w:val="center"/>
-          </w:tcPr>
-          <w:p>
-            <w:pPr>
-              <w:spacing w:before="0" w:after="0"/>
-              <w:jc w:val="left"/>
-            </w:pPr>
-            <w:r/>
-            <w:r>
-              <w:rPr>
-                <w:rFonts w:ascii="宋体" w:hAnsi="宋体" w:eastAsia="宋体"/>
-                <w:b w:val="0"/>
-                <w:sz w:val="21"/>
-              </w:rPr>
-              <w:t>{hotel_2_vendor}</w:t>
-            </w:r>
-          </w:p>
-        </w:tc>
-        <w:tc>
-          <w:tcPr>
-            <w:tcW w:type="dxa" w:w="1588"/>
-            <w:gridSpan w:val="4"/>
-            <w:tcBorders>
-              <w:left w:val="single" w:sz="8" w:color="BFBFBF"/>
-              <w:top w:val="single" w:sz="8" w:color="BFBFBF"/>
-              <w:right w:val="single" w:sz="8" w:color="BFBFBF"/>
-              <w:bottom w:val="single" w:sz="8" w:color="BFBFBF"/>
-            </w:tcBorders>
-            <w:vAlign w:val="center"/>
-          </w:tcPr>
-          <w:p>
-            <w:pPr>
-              <w:spacing w:before="0" w:after="0"/>
-              <w:jc w:val="left"/>
-            </w:pPr>
-            <w:r/>
-            <w:r>
-              <w:rPr>
-                <w:rFonts w:ascii="宋体" w:hAnsi="宋体" w:eastAsia="宋体"/>
-                <w:b w:val="0"/>
-                <w:sz w:val="21"/>
-              </w:rPr>
-              <w:t>{hotel_2_quote_at}</w:t>
-            </w:r>
-          </w:p>
-        </w:tc>
-      </w:tr>
-      <w:tr>
-        <w:trPr>
-          <w:trHeight w:hRule="atLeast" w:val="652"/>
-        </w:trPr>
-        <w:tc>
-          <w:tcPr>
-            <w:tcW w:type="dxa" w:w="1644"/>
-            <w:tcBorders>
-              <w:left w:val="single" w:sz="8" w:color="BFBFBF"/>
-              <w:top w:val="single" w:sz="8" w:color="BFBFBF"/>
-              <w:right w:val="single" w:sz="8" w:color="BFBFBF"/>
-              <w:bottom w:val="single" w:sz="8" w:color="BFBFBF"/>
-            </w:tcBorders>
-            <w:vAlign w:val="center"/>
-          </w:tcPr>
-          <w:p>
-            <w:pPr>
-              <w:spacing w:before="0" w:after="0"/>
-              <w:jc w:val="center"/>
-            </w:pPr>
-            <w:r/>
-            <w:r>
-              <w:rPr>
-                <w:rFonts w:ascii="宋体" w:hAnsi="宋体" w:eastAsia="宋体"/>
-                <w:b w:val="0"/>
-                <w:sz w:val="24"/>
-              </w:rPr>
-              <w:t>方案3：</w:t>
-            </w:r>
-          </w:p>
-        </w:tc>
-        <w:tc>
-          <w:tcPr>
-            <w:tcW w:type="dxa" w:w="1588"/>
-            <w:gridSpan w:val="4"/>
-            <w:tcBorders>
-              <w:left w:val="single" w:sz="8" w:color="BFBFBF"/>
-              <w:top w:val="single" w:sz="8" w:color="BFBFBF"/>
-              <w:right w:val="single" w:sz="8" w:color="BFBFBF"/>
-              <w:bottom w:val="single" w:sz="8" w:color="BFBFBF"/>
-            </w:tcBorders>
-            <w:vAlign w:val="center"/>
-          </w:tcPr>
-          <w:p>
-            <w:pPr>
-              <w:spacing w:before="0" w:after="0"/>
-              <w:jc w:val="left"/>
-            </w:pPr>
-            <w:r/>
-            <w:r>
-              <w:rPr>
-                <w:rFonts w:ascii="宋体" w:hAnsi="宋体" w:eastAsia="宋体"/>
-                <w:b w:val="0"/>
-                <w:sz w:val="21"/>
-              </w:rPr>
-              <w:t>{hotel_3_check_in}</w:t>
-            </w:r>
-          </w:p>
-        </w:tc>
-        <w:tc>
-          <w:tcPr>
-            <w:tcW w:type="dxa" w:w="1588"/>
-            <w:gridSpan w:val="4"/>
-            <w:tcBorders>
-              <w:left w:val="single" w:sz="8" w:color="BFBFBF"/>
-              <w:top w:val="single" w:sz="8" w:color="BFBFBF"/>
-              <w:right w:val="single" w:sz="8" w:color="BFBFBF"/>
-              <w:bottom w:val="single" w:sz="8" w:color="BFBFBF"/>
-            </w:tcBorders>
-            <w:vAlign w:val="center"/>
-          </w:tcPr>
-          <w:p>
-            <w:pPr>
-              <w:spacing w:before="0" w:after="0"/>
-              <w:jc w:val="left"/>
-            </w:pPr>
-            <w:r/>
-            <w:r>
-              <w:rPr>
-                <w:rFonts w:ascii="宋体" w:hAnsi="宋体" w:eastAsia="宋体"/>
-                <w:b w:val="0"/>
-                <w:sz w:val="21"/>
-              </w:rPr>
-              <w:t>{hotel_3_check_out}</w:t>
-            </w:r>
-          </w:p>
-        </w:tc>
-        <w:tc>
-          <w:tcPr>
-            <w:tcW w:type="dxa" w:w="1588"/>
-            <w:gridSpan w:val="4"/>
-            <w:tcBorders>
-              <w:left w:val="single" w:sz="8" w:color="BFBFBF"/>
-              <w:top w:val="single" w:sz="8" w:color="BFBFBF"/>
-              <w:right w:val="single" w:sz="8" w:color="BFBFBF"/>
-              <w:bottom w:val="single" w:sz="8" w:color="BFBFBF"/>
-            </w:tcBorders>
-            <w:vAlign w:val="center"/>
-          </w:tcPr>
-          <w:p>
-            <w:pPr>
-              <w:spacing w:before="0" w:after="0"/>
-              <w:jc w:val="left"/>
-            </w:pPr>
-            <w:r/>
-            <w:r>
-              <w:rPr>
-                <w:rFonts w:ascii="宋体" w:hAnsi="宋体" w:eastAsia="宋体"/>
-                <w:b w:val="0"/>
-                <w:sz w:val="21"/>
-              </w:rPr>
-              <w:t>{hotel_3_budget}</w:t>
-            </w:r>
-          </w:p>
-        </w:tc>
-        <w:tc>
-          <w:tcPr>
-            <w:tcW w:type="dxa" w:w="1588"/>
-            <w:gridSpan w:val="4"/>
-            <w:tcBorders>
-              <w:left w:val="single" w:sz="8" w:color="BFBFBF"/>
-              <w:top w:val="single" w:sz="8" w:color="BFBFBF"/>
-              <w:right w:val="single" w:sz="8" w:color="BFBFBF"/>
-              <w:bottom w:val="single" w:sz="8" w:color="BFBFBF"/>
-            </w:tcBorders>
-            <w:vAlign w:val="center"/>
-          </w:tcPr>
-          <w:p>
-            <w:pPr>
-              <w:spacing w:before="0" w:after="0"/>
-              <w:jc w:val="left"/>
-            </w:pPr>
-            <w:r/>
-            <w:r>
-              <w:rPr>
-                <w:rFonts w:ascii="宋体" w:hAnsi="宋体" w:eastAsia="宋体"/>
-                <w:b w:val="0"/>
-                <w:sz w:val="21"/>
-              </w:rPr>
-              <w:t>{hotel_3_vendor}</w:t>
-            </w:r>
-          </w:p>
-        </w:tc>
-        <w:tc>
-          <w:tcPr>
-            <w:tcW w:type="dxa" w:w="1588"/>
-            <w:gridSpan w:val="4"/>
-            <w:tcBorders>
-              <w:left w:val="single" w:sz="8" w:color="BFBFBF"/>
-              <w:top w:val="single" w:sz="8" w:color="BFBFBF"/>
-              <w:right w:val="single" w:sz="8" w:color="BFBFBF"/>
-              <w:bottom w:val="single" w:sz="8" w:color="BFBFBF"/>
-            </w:tcBorders>
-            <w:vAlign w:val="center"/>
-          </w:tcPr>
-          <w:p>
-            <w:pPr>
-              <w:spacing w:before="0" w:after="0"/>
-              <w:jc w:val="left"/>
-            </w:pPr>
-            <w:r/>
-            <w:r>
-              <w:rPr>
-                <w:rFonts w:ascii="宋体" w:hAnsi="宋体" w:eastAsia="宋体"/>
-                <w:b w:val="0"/>
-                <w:sz w:val="21"/>
-              </w:rPr>
-              <w:t>{hotel_3_quote_at}</w:t>
-            </w:r>
-          </w:p>
-        </w:tc>
-      </w:tr>
-      <w:tr>
-        <w:trPr>
-          <w:trHeight w:hRule="atLeast" w:val="595"/>
-        </w:trPr>
-        <w:tc>
-          <w:tcPr>
-            <w:tcW w:type="dxa" w:w="1644"/>
-            <w:tcBorders>
-              <w:left w:val="single" w:sz="8" w:color="BFBFBF"/>
-              <w:top w:val="single" w:sz="8" w:color="BFBFBF"/>
-              <w:right w:val="single" w:sz="8" w:color="BFBFBF"/>
-              <w:bottom w:val="single" w:sz="8" w:color="BFBFBF"/>
-            </w:tcBorders>
-            <w:vAlign w:val="center"/>
-          </w:tcPr>
-          <w:p>
-            <w:pPr>
-              <w:spacing w:before="0" w:after="0"/>
-              <w:jc w:val="center"/>
-            </w:pPr>
-            <w:r/>
-            <w:r>
-              <w:rPr>
-                <w:rFonts w:ascii="宋体" w:hAnsi="宋体" w:eastAsia="宋体"/>
-                <w:b w:val="0"/>
-                <w:sz w:val="24"/>
-              </w:rPr>
-              <w:t>餐费总支出</w:t>
-            </w:r>
-          </w:p>
-        </w:tc>
-        <w:tc>
-          <w:tcPr>
-            <w:tcW w:type="dxa" w:w="3176"/>
-            <w:gridSpan w:val="8"/>
-            <w:tcBorders>
-              <w:left w:val="single" w:sz="8" w:color="BFBFBF"/>
-              <w:top w:val="single" w:sz="8" w:color="BFBFBF"/>
-              <w:right w:val="single" w:sz="8" w:color="BFBFBF"/>
-              <w:bottom w:val="single" w:sz="8" w:color="BFBFBF"/>
-            </w:tcBorders>
-            <w:vAlign w:val="center"/>
-          </w:tcPr>
-          <w:p>
-            <w:pPr>
-              <w:spacing w:before="0" w:after="0"/>
+              <w:spacing w:before="0" w:after="0" w:line="240" w:lineRule="auto"/>
               <w:jc w:val="left"/>
             </w:pPr>
             <w:r/>
@@ -1932,8 +1329,8 @@
         </w:tc>
         <w:tc>
           <w:tcPr>
-            <w:tcW w:type="dxa" w:w="2779"/>
-            <w:gridSpan w:val="7"/>
+            <w:tcW w:type="dxa" w:w="3402"/>
+            <w:gridSpan w:val="2"/>
             <w:tcBorders>
               <w:left w:val="single" w:sz="8" w:color="BFBFBF"/>
               <w:top w:val="single" w:sz="8" w:color="BFBFBF"/>
@@ -1944,7 +1341,7 @@
           </w:tcPr>
           <w:p>
             <w:pPr>
-              <w:spacing w:before="0" w:after="0"/>
+              <w:spacing w:before="0" w:after="0" w:line="240" w:lineRule="auto"/>
               <w:jc w:val="center"/>
             </w:pPr>
             <w:r/>
@@ -1952,7 +1349,7 @@
               <w:rPr>
                 <w:rFonts w:ascii="宋体" w:hAnsi="宋体" w:eastAsia="宋体"/>
                 <w:b w:val="0"/>
-                <w:sz w:val="24"/>
+                <w:sz w:val="22"/>
               </w:rPr>
               <w:t>地面交通费总支出</w:t>
             </w:r>
@@ -1960,8 +1357,7 @@
         </w:tc>
         <w:tc>
           <w:tcPr>
-            <w:tcW w:type="dxa" w:w="1985"/>
-            <w:gridSpan w:val="5"/>
+            <w:tcW w:type="dxa" w:w="1701"/>
             <w:tcBorders>
               <w:left w:val="single" w:sz="8" w:color="BFBFBF"/>
               <w:top w:val="single" w:sz="8" w:color="BFBFBF"/>
@@ -1972,7 +1368,7 @@
           </w:tcPr>
           <w:p>
             <w:pPr>
-              <w:spacing w:before="0" w:after="0"/>
+              <w:spacing w:before="0" w:after="0" w:line="240" w:lineRule="auto"/>
               <w:jc w:val="left"/>
             </w:pPr>
             <w:r/>
@@ -1988,12 +1384,9 @@
         </w:tc>
       </w:tr>
       <w:tr>
-        <w:trPr>
-          <w:trHeight w:hRule="atLeast" w:val="624"/>
-        </w:trPr>
         <w:tc>
           <w:tcPr>
-            <w:tcW w:type="dxa" w:w="1644"/>
+            <w:tcW w:type="dxa" w:w="1587"/>
             <w:tcBorders>
               <w:left w:val="single" w:sz="8" w:color="BFBFBF"/>
               <w:top w:val="single" w:sz="8" w:color="BFBFBF"/>
@@ -2004,7 +1397,7 @@
           </w:tcPr>
           <w:p>
             <w:pPr>
-              <w:spacing w:before="0" w:after="0"/>
+              <w:spacing w:before="0" w:after="0" w:line="240" w:lineRule="auto"/>
               <w:jc w:val="center"/>
             </w:pPr>
             <w:r/>
@@ -2012,7 +1405,7 @@
               <w:rPr>
                 <w:rFonts w:ascii="宋体" w:hAnsi="宋体" w:eastAsia="宋体"/>
                 <w:b w:val="0"/>
-                <w:sz w:val="24"/>
+                <w:sz w:val="22"/>
               </w:rPr>
               <w:t>其它支出</w:t>
             </w:r>
@@ -2020,8 +1413,8 @@
         </w:tc>
         <w:tc>
           <w:tcPr>
-            <w:tcW w:type="dxa" w:w="7940"/>
-            <w:gridSpan w:val="20"/>
+            <w:tcW w:type="dxa" w:w="8505"/>
+            <w:gridSpan w:val="5"/>
             <w:tcBorders>
               <w:left w:val="single" w:sz="8" w:color="BFBFBF"/>
               <w:top w:val="single" w:sz="8" w:color="BFBFBF"/>
@@ -2032,7 +1425,7 @@
           </w:tcPr>
           <w:p>
             <w:pPr>
-              <w:spacing w:before="0" w:after="0"/>
+              <w:spacing w:before="0" w:after="0" w:line="240" w:lineRule="auto"/>
               <w:jc w:val="left"/>
             </w:pPr>
             <w:r/>
@@ -2048,12 +1441,9 @@
         </w:tc>
       </w:tr>
       <w:tr>
-        <w:trPr>
-          <w:trHeight w:hRule="atLeast" w:val="595"/>
-        </w:trPr>
         <w:tc>
           <w:tcPr>
-            <w:tcW w:type="dxa" w:w="1644"/>
+            <w:tcW w:type="dxa" w:w="1587"/>
             <w:tcBorders>
               <w:left w:val="single" w:sz="8" w:color="BFBFBF"/>
               <w:top w:val="single" w:sz="8" w:color="BFBFBF"/>
@@ -2064,7 +1454,7 @@
           </w:tcPr>
           <w:p>
             <w:pPr>
-              <w:spacing w:before="0" w:after="0"/>
+              <w:spacing w:before="0" w:after="0" w:line="240" w:lineRule="auto"/>
               <w:jc w:val="center"/>
             </w:pPr>
             <w:r/>
@@ -2072,7 +1462,7 @@
               <w:rPr>
                 <w:rFonts w:ascii="宋体" w:hAnsi="宋体" w:eastAsia="宋体"/>
                 <w:b w:val="0"/>
-                <w:sz w:val="24"/>
+                <w:sz w:val="22"/>
               </w:rPr>
               <w:t>总支出（预算）</w:t>
             </w:r>
@@ -2080,8 +1470,8 @@
         </w:tc>
         <w:tc>
           <w:tcPr>
-            <w:tcW w:type="dxa" w:w="3176"/>
-            <w:gridSpan w:val="8"/>
+            <w:tcW w:type="dxa" w:w="3402"/>
+            <w:gridSpan w:val="2"/>
             <w:tcBorders>
               <w:left w:val="single" w:sz="8" w:color="BFBFBF"/>
               <w:top w:val="single" w:sz="8" w:color="BFBFBF"/>
@@ -2092,7 +1482,7 @@
           </w:tcPr>
           <w:p>
             <w:pPr>
-              <w:spacing w:before="0" w:after="0"/>
+              <w:spacing w:before="0" w:after="0" w:line="240" w:lineRule="auto"/>
               <w:jc w:val="left"/>
             </w:pPr>
             <w:r/>
@@ -2108,8 +1498,8 @@
         </w:tc>
         <w:tc>
           <w:tcPr>
-            <w:tcW w:type="dxa" w:w="2779"/>
-            <w:gridSpan w:val="7"/>
+            <w:tcW w:type="dxa" w:w="3402"/>
+            <w:gridSpan w:val="2"/>
             <w:tcBorders>
               <w:left w:val="single" w:sz="8" w:color="BFBFBF"/>
               <w:top w:val="single" w:sz="8" w:color="BFBFBF"/>
@@ -2120,7 +1510,7 @@
           </w:tcPr>
           <w:p>
             <w:pPr>
-              <w:spacing w:before="0" w:after="0"/>
+              <w:spacing w:before="0" w:after="0" w:line="240" w:lineRule="auto"/>
               <w:jc w:val="center"/>
             </w:pPr>
             <w:r/>
@@ -2128,7 +1518,7 @@
               <w:rPr>
                 <w:rFonts w:ascii="宋体" w:hAnsi="宋体" w:eastAsia="宋体"/>
                 <w:b w:val="0"/>
-                <w:sz w:val="24"/>
+                <w:sz w:val="22"/>
               </w:rPr>
               <w:t>总支出（实际）</w:t>
             </w:r>
@@ -2136,8 +1526,7 @@
         </w:tc>
         <w:tc>
           <w:tcPr>
-            <w:tcW w:type="dxa" w:w="1985"/>
-            <w:gridSpan w:val="5"/>
+            <w:tcW w:type="dxa" w:w="1701"/>
             <w:tcBorders>
               <w:left w:val="single" w:sz="8" w:color="BFBFBF"/>
               <w:top w:val="single" w:sz="8" w:color="BFBFBF"/>
@@ -2148,7 +1537,7 @@
           </w:tcPr>
           <w:p>
             <w:pPr>
-              <w:spacing w:before="0" w:after="0"/>
+              <w:spacing w:before="0" w:after="0" w:line="240" w:lineRule="auto"/>
               <w:jc w:val="left"/>
             </w:pPr>
             <w:r/>
@@ -2164,12 +1553,9 @@
         </w:tc>
       </w:tr>
       <w:tr>
-        <w:trPr>
-          <w:trHeight w:hRule="atLeast" w:val="595"/>
-        </w:trPr>
         <w:tc>
           <w:tcPr>
-            <w:tcW w:type="dxa" w:w="1644"/>
+            <w:tcW w:type="dxa" w:w="1587"/>
             <w:tcBorders>
               <w:left w:val="single" w:sz="8" w:color="BFBFBF"/>
               <w:top w:val="single" w:sz="8" w:color="BFBFBF"/>
@@ -2180,7 +1566,7 @@
           </w:tcPr>
           <w:p>
             <w:pPr>
-              <w:spacing w:before="0" w:after="0"/>
+              <w:spacing w:before="0" w:after="0" w:line="240" w:lineRule="auto"/>
               <w:jc w:val="center"/>
             </w:pPr>
             <w:r/>
@@ -2188,7 +1574,7 @@
               <w:rPr>
                 <w:rFonts w:ascii="宋体" w:hAnsi="宋体" w:eastAsia="宋体"/>
                 <w:b w:val="0"/>
-                <w:sz w:val="24"/>
+                <w:sz w:val="22"/>
               </w:rPr>
               <w:t>部门主管审核</w:t>
             </w:r>
@@ -2196,8 +1582,8 @@
         </w:tc>
         <w:tc>
           <w:tcPr>
-            <w:tcW w:type="dxa" w:w="3176"/>
-            <w:gridSpan w:val="8"/>
+            <w:tcW w:type="dxa" w:w="3402"/>
+            <w:gridSpan w:val="2"/>
             <w:tcBorders>
               <w:left w:val="single" w:sz="8" w:color="BFBFBF"/>
               <w:top w:val="single" w:sz="8" w:color="BFBFBF"/>
@@ -2208,7 +1594,7 @@
           </w:tcPr>
           <w:p>
             <w:pPr>
-              <w:spacing w:before="0" w:after="0"/>
+              <w:spacing w:before="0" w:after="0" w:line="240" w:lineRule="auto"/>
               <w:jc w:val="left"/>
             </w:pPr>
             <w:r/>
@@ -2223,8 +1609,8 @@
         </w:tc>
         <w:tc>
           <w:tcPr>
-            <w:tcW w:type="dxa" w:w="2779"/>
-            <w:gridSpan w:val="7"/>
+            <w:tcW w:type="dxa" w:w="3402"/>
+            <w:gridSpan w:val="2"/>
             <w:tcBorders>
               <w:left w:val="single" w:sz="8" w:color="BFBFBF"/>
               <w:top w:val="single" w:sz="8" w:color="BFBFBF"/>
@@ -2235,7 +1621,7 @@
           </w:tcPr>
           <w:p>
             <w:pPr>
-              <w:spacing w:before="0" w:after="0"/>
+              <w:spacing w:before="0" w:after="0" w:line="240" w:lineRule="auto"/>
               <w:jc w:val="center"/>
             </w:pPr>
             <w:r/>
@@ -2243,7 +1629,7 @@
               <w:rPr>
                 <w:rFonts w:ascii="宋体" w:hAnsi="宋体" w:eastAsia="宋体"/>
                 <w:b w:val="0"/>
-                <w:sz w:val="24"/>
+                <w:sz w:val="22"/>
               </w:rPr>
               <w:t>部门主管签名</w:t>
             </w:r>
@@ -2251,8 +1637,7 @@
         </w:tc>
         <w:tc>
           <w:tcPr>
-            <w:tcW w:type="dxa" w:w="1985"/>
-            <w:gridSpan w:val="5"/>
+            <w:tcW w:type="dxa" w:w="1701"/>
             <w:tcBorders>
               <w:left w:val="single" w:sz="8" w:color="BFBFBF"/>
               <w:top w:val="single" w:sz="8" w:color="BFBFBF"/>
@@ -2263,7 +1648,7 @@
           </w:tcPr>
           <w:p>
             <w:pPr>
-              <w:spacing w:before="0" w:after="0"/>
+              <w:spacing w:before="0" w:after="0" w:line="240" w:lineRule="auto"/>
               <w:jc w:val="left"/>
             </w:pPr>
             <w:r/>
@@ -2278,12 +1663,9 @@
         </w:tc>
       </w:tr>
       <w:tr>
-        <w:trPr>
-          <w:trHeight w:hRule="atLeast" w:val="595"/>
-        </w:trPr>
         <w:tc>
           <w:tcPr>
-            <w:tcW w:type="dxa" w:w="1644"/>
+            <w:tcW w:type="dxa" w:w="1587"/>
             <w:tcBorders>
               <w:left w:val="single" w:sz="8" w:color="BFBFBF"/>
               <w:top w:val="single" w:sz="8" w:color="BFBFBF"/>
@@ -2294,7 +1676,7 @@
           </w:tcPr>
           <w:p>
             <w:pPr>
-              <w:spacing w:before="0" w:after="0"/>
+              <w:spacing w:before="0" w:after="0" w:line="240" w:lineRule="auto"/>
               <w:jc w:val="center"/>
             </w:pPr>
             <w:r/>
@@ -2302,7 +1684,7 @@
               <w:rPr>
                 <w:rFonts w:ascii="宋体" w:hAnsi="宋体" w:eastAsia="宋体"/>
                 <w:b w:val="0"/>
-                <w:sz w:val="24"/>
+                <w:sz w:val="22"/>
               </w:rPr>
               <w:t>总经理批准</w:t>
             </w:r>
@@ -2310,8 +1692,8 @@
         </w:tc>
         <w:tc>
           <w:tcPr>
-            <w:tcW w:type="dxa" w:w="3176"/>
-            <w:gridSpan w:val="8"/>
+            <w:tcW w:type="dxa" w:w="3402"/>
+            <w:gridSpan w:val="2"/>
             <w:tcBorders>
               <w:left w:val="single" w:sz="8" w:color="BFBFBF"/>
               <w:top w:val="single" w:sz="8" w:color="BFBFBF"/>
@@ -2322,7 +1704,7 @@
           </w:tcPr>
           <w:p>
             <w:pPr>
-              <w:spacing w:before="0" w:after="0"/>
+              <w:spacing w:before="0" w:after="0" w:line="240" w:lineRule="auto"/>
               <w:jc w:val="left"/>
             </w:pPr>
             <w:r/>
@@ -2337,8 +1719,8 @@
         </w:tc>
         <w:tc>
           <w:tcPr>
-            <w:tcW w:type="dxa" w:w="2779"/>
-            <w:gridSpan w:val="7"/>
+            <w:tcW w:type="dxa" w:w="3402"/>
+            <w:gridSpan w:val="2"/>
             <w:tcBorders>
               <w:left w:val="single" w:sz="8" w:color="BFBFBF"/>
               <w:top w:val="single" w:sz="8" w:color="BFBFBF"/>
@@ -2349,7 +1731,7 @@
           </w:tcPr>
           <w:p>
             <w:pPr>
-              <w:spacing w:before="0" w:after="0"/>
+              <w:spacing w:before="0" w:after="0" w:line="240" w:lineRule="auto"/>
               <w:jc w:val="center"/>
             </w:pPr>
             <w:r/>
@@ -2357,7 +1739,7 @@
               <w:rPr>
                 <w:rFonts w:ascii="宋体" w:hAnsi="宋体" w:eastAsia="宋体"/>
                 <w:b w:val="0"/>
-                <w:sz w:val="24"/>
+                <w:sz w:val="22"/>
               </w:rPr>
               <w:t>总经理签名</w:t>
             </w:r>
@@ -2365,8 +1747,7 @@
         </w:tc>
         <w:tc>
           <w:tcPr>
-            <w:tcW w:type="dxa" w:w="1985"/>
-            <w:gridSpan w:val="5"/>
+            <w:tcW w:type="dxa" w:w="1701"/>
             <w:tcBorders>
               <w:left w:val="single" w:sz="8" w:color="BFBFBF"/>
               <w:top w:val="single" w:sz="8" w:color="BFBFBF"/>
@@ -2377,7 +1758,7 @@
           </w:tcPr>
           <w:p>
             <w:pPr>
-              <w:spacing w:before="0" w:after="0"/>
+              <w:spacing w:before="0" w:after="0" w:line="240" w:lineRule="auto"/>
               <w:jc w:val="left"/>
             </w:pPr>
             <w:r/>
@@ -2392,10 +1773,9 @@
         </w:tc>
       </w:tr>
     </w:tbl>
-    <w:p/>
     <w:p>
       <w:pPr>
-        <w:spacing w:after="40"/>
+        <w:spacing w:before="200" w:after="40"/>
       </w:pPr>
       <w:r>
         <w:rPr>
@@ -2413,14 +1793,14 @@
       <w:r>
         <w:rPr>
           <w:rFonts w:ascii="宋体" w:hAnsi="宋体" w:eastAsia="宋体"/>
-          <w:sz w:val="24"/>
+          <w:sz w:val="22"/>
         </w:rPr>
         <w:t>基本原则：</w:t>
       </w:r>
       <w:r>
         <w:rPr>
           <w:rFonts w:ascii="宋体" w:hAnsi="宋体" w:eastAsia="宋体"/>
-          <w:sz w:val="24"/>
+          <w:sz w:val="22"/>
           <w:u w:val="single"/>
         </w:rPr>
         <w:t>厉行节约、预算控制、事前审批、真实合规</w:t>
@@ -2428,7 +1808,7 @@
       <w:r>
         <w:rPr>
           <w:rFonts w:ascii="宋体" w:hAnsi="宋体" w:eastAsia="宋体"/>
-          <w:sz w:val="24"/>
+          <w:sz w:val="22"/>
         </w:rPr>
         <w:t>。</w:t>
       </w:r>
@@ -2440,14 +1820,14 @@
       <w:r>
         <w:rPr>
           <w:rFonts w:ascii="宋体" w:hAnsi="宋体" w:eastAsia="宋体"/>
-          <w:sz w:val="24"/>
+          <w:sz w:val="22"/>
         </w:rPr>
         <w:t>出差前填写申请表，明确</w:t>
       </w:r>
       <w:r>
         <w:rPr>
           <w:rFonts w:ascii="宋体" w:hAnsi="宋体" w:eastAsia="宋体"/>
-          <w:sz w:val="24"/>
+          <w:sz w:val="22"/>
           <w:u w:val="single"/>
         </w:rPr>
         <w:t>出差事由、时间、地点、预算</w:t>
@@ -2455,7 +1835,7 @@
       <w:r>
         <w:rPr>
           <w:rFonts w:ascii="宋体" w:hAnsi="宋体" w:eastAsia="宋体"/>
-          <w:sz w:val="24"/>
+          <w:sz w:val="22"/>
         </w:rPr>
         <w:t>，并完成部门主管审核和总经理批准。</w:t>
       </w:r>
@@ -2467,24 +1847,24 @@
       <w:r>
         <w:rPr>
           <w:rFonts w:ascii="宋体" w:hAnsi="宋体" w:eastAsia="宋体"/>
-          <w:sz w:val="24"/>
+          <w:sz w:val="22"/>
         </w:rPr>
         <w:t>城市间交通优先选择经济便捷的交通工具，</w:t>
       </w:r>
       <w:r>
         <w:rPr>
           <w:rFonts w:ascii="宋体" w:hAnsi="宋体" w:eastAsia="宋体"/>
-          <w:sz w:val="24"/>
+          <w:sz w:val="22"/>
           <w:u w:val="single"/>
         </w:rPr>
-        <w:t>三选一</w:t>
+        <w:t>同一行程按 3 个方案比价</w:t>
       </w:r>
       <w:r>
         <w:rPr>
           <w:rFonts w:ascii="宋体" w:hAnsi="宋体" w:eastAsia="宋体"/>
-          <w:sz w:val="24"/>
+          <w:sz w:val="22"/>
         </w:rPr>
-        <w:t>；特殊情况需提前说明，未经许可超标部分由个人承担。</w:t>
+        <w:t>，最低预算默认为最佳方案。</w:t>
       </w:r>
     </w:p>
     <w:p>
@@ -2494,14 +1874,14 @@
       <w:r>
         <w:rPr>
           <w:rFonts w:ascii="宋体" w:hAnsi="宋体" w:eastAsia="宋体"/>
-          <w:sz w:val="24"/>
+          <w:sz w:val="22"/>
         </w:rPr>
         <w:t>住宿标准：</w:t>
       </w:r>
       <w:r>
         <w:rPr>
           <w:rFonts w:ascii="宋体" w:hAnsi="宋体" w:eastAsia="宋体"/>
-          <w:sz w:val="24"/>
+          <w:sz w:val="22"/>
           <w:u w:val="single"/>
         </w:rPr>
         <w:t>一线城市 1000 元/晚以内，省会城市 800 元/晚以内，其他城市 600 元/晚以内</w:t>
@@ -2509,7 +1889,7 @@
       <w:r>
         <w:rPr>
           <w:rFonts w:ascii="宋体" w:hAnsi="宋体" w:eastAsia="宋体"/>
-          <w:sz w:val="24"/>
+          <w:sz w:val="22"/>
         </w:rPr>
         <w:t>。</w:t>
       </w:r>
@@ -2521,14 +1901,14 @@
       <w:r>
         <w:rPr>
           <w:rFonts w:ascii="宋体" w:hAnsi="宋体" w:eastAsia="宋体"/>
-          <w:sz w:val="24"/>
+          <w:sz w:val="22"/>
         </w:rPr>
         <w:t>餐费和市内交通费</w:t>
       </w:r>
       <w:r>
         <w:rPr>
           <w:rFonts w:ascii="宋体" w:hAnsi="宋体" w:eastAsia="宋体"/>
-          <w:sz w:val="24"/>
+          <w:sz w:val="22"/>
           <w:u w:val="single"/>
         </w:rPr>
         <w:t>标准内根据有效票据实报实销</w:t>
@@ -2536,7 +1916,7 @@
       <w:r>
         <w:rPr>
           <w:rFonts w:ascii="宋体" w:hAnsi="宋体" w:eastAsia="宋体"/>
-          <w:sz w:val="24"/>
+          <w:sz w:val="22"/>
         </w:rPr>
         <w:t>；接待单位安排工作餐或交通工具的，不单独报销。</w:t>
       </w:r>
@@ -2548,14 +1928,14 @@
       <w:r>
         <w:rPr>
           <w:rFonts w:ascii="宋体" w:hAnsi="宋体" w:eastAsia="宋体"/>
-          <w:sz w:val="24"/>
+          <w:sz w:val="22"/>
         </w:rPr>
         <w:t>报销须在</w:t>
       </w:r>
       <w:r>
         <w:rPr>
           <w:rFonts w:ascii="宋体" w:hAnsi="宋体" w:eastAsia="宋体"/>
-          <w:sz w:val="24"/>
+          <w:sz w:val="22"/>
           <w:u w:val="single"/>
         </w:rPr>
         <w:t>出差结束后 7 个工作日内</w:t>
@@ -2563,7 +1943,7 @@
       <w:r>
         <w:rPr>
           <w:rFonts w:ascii="宋体" w:hAnsi="宋体" w:eastAsia="宋体"/>
-          <w:sz w:val="24"/>
+          <w:sz w:val="22"/>
         </w:rPr>
         <w:t>完成，超期需书面说明。</w:t>
       </w:r>
@@ -2575,14 +1955,14 @@
       <w:r>
         <w:rPr>
           <w:rFonts w:ascii="宋体" w:hAnsi="宋体" w:eastAsia="宋体"/>
-          <w:sz w:val="24"/>
+          <w:sz w:val="22"/>
         </w:rPr>
         <w:t>所有票据及附件需</w:t>
       </w:r>
       <w:r>
         <w:rPr>
           <w:rFonts w:ascii="宋体" w:hAnsi="宋体" w:eastAsia="宋体"/>
-          <w:sz w:val="24"/>
+          <w:sz w:val="22"/>
           <w:u w:val="single"/>
         </w:rPr>
         <w:t>真实、合法、完整</w:t>
@@ -2590,14 +1970,14 @@
       <w:r>
         <w:rPr>
           <w:rFonts w:ascii="宋体" w:hAnsi="宋体" w:eastAsia="宋体"/>
-          <w:sz w:val="24"/>
+          <w:sz w:val="22"/>
         </w:rPr>
         <w:t>，用于纳税和审计。</w:t>
       </w:r>
     </w:p>
     <w:sectPr>
       <w:pgSz w:w="11906" w:h="16838"/>
-      <w:pgMar w:top="1020" w:right="680" w:bottom="1020" w:left="680" w:header="720" w:footer="720" w:gutter="0"/>
+      <w:pgMar w:top="907" w:right="737" w:bottom="907" w:left="737" w:header="720" w:footer="720" w:gutter="0"/>
       <w:cols w:space="720"/>
       <w:docGrid w:linePitch="360"/>
     </w:sectPr>

</xml_diff>